<commit_message>
Update .gitignore to include mcp_server directory; add next-auth dependency in package.json and package-lock.json; modify WFH request document for clarity and conciseness
</commit_message>
<xml_diff>
--- a/server/wfh request agent/WFH Request - Delano Martin.docx
+++ b/server/wfh request agent/WFH Request - Delano Martin.docx
@@ -19,378 +19,14 @@
         <w:tblLook w:val="04A0" w:firstRow="1" w:lastRow="0" w:firstColumn="1" w:lastColumn="0" w:noHBand="0" w:noVBand="1"/>
       </w:tblPr>
       <w:tblGrid>
-        <w:gridCol w:w="5671"/>
-        <w:gridCol w:w="283"/>
-        <w:gridCol w:w="2552"/>
-        <w:gridCol w:w="992"/>
+        <w:gridCol w:w="9498"/>
         <w:gridCol w:w="2552"/>
         <w:gridCol w:w="992"/>
       </w:tblGrid>
       <w:tr>
-        <w:trPr>
-          <w:gridAfter w:val="2"/>
-          <w:wAfter w:w="3544" w:type="dxa"/>
-        </w:trPr>
-        <w:tc>
-          <w:tcPr>
-            <w:tcW w:w="5671" w:type="dxa"/>
-            <w:vMerge w:val="restart"/>
-          </w:tcPr>
-          <w:sdt>
-            <w:sdtPr>
-              <w:alias w:val="Addressee's Name, Title, Co, Address. Use Enter for a new line"/>
-              <w:tag w:val="Addressee"/>
-              <w:id w:val="1986118988"/>
-              <w:placeholder>
-                <w:docPart w:val="1C8175ADAE644306BD623AA062986D0A"/>
-              </w:placeholder>
-              <w15:color w:val="FF99CC"/>
-            </w:sdtPr>
-            <w:sdtContent>
-              <w:p>
-                <w:pPr>
-                  <w:pStyle w:val="LetterAddressText"/>
-                </w:pPr>
-                <w:r>
-                  <w:t>Nikita Lalla</w:t>
-                </w:r>
-              </w:p>
-              <w:p>
-                <w:pPr>
-                  <w:pStyle w:val="LetterAddressText"/>
-                </w:pPr>
-                <w:r>
-                  <w:t>Department Head</w:t>
-                </w:r>
-              </w:p>
-              <w:p>
-                <w:pPr>
-                  <w:pStyle w:val="LetterAddressText"/>
-                </w:pPr>
-                <w:r>
-                  <w:t>LNP Beyond Legal</w:t>
-                </w:r>
-              </w:p>
-            </w:sdtContent>
-          </w:sdt>
-          <w:p>
-            <w:pPr>
-              <w:pStyle w:val="LetterAddressText"/>
-            </w:pPr>
-          </w:p>
-          <w:sdt>
-            <w:sdtPr>
-              <w:alias w:val="Enter Email or For Attention details if applicable"/>
-              <w:tag w:val="Addressee"/>
-              <w:id w:val="852147284"/>
-              <w:placeholder>
-                <w:docPart w:val="6E04C38900AD4D7EA1D77BC74B787406"/>
-              </w:placeholder>
-              <w15:color w:val="FF99CC"/>
-            </w:sdtPr>
-            <w:sdtContent>
-              <w:p>
-                <w:pPr>
-                  <w:pStyle w:val="LetterEmail"/>
-                </w:pPr>
-              </w:p>
-            </w:sdtContent>
-          </w:sdt>
-        </w:tc>
-        <w:tc>
-          <w:tcPr>
-            <w:tcW w:w="283" w:type="dxa"/>
-          </w:tcPr>
-          <w:p>
-            <w:pPr>
-              <w:pStyle w:val="LetterRefs"/>
-            </w:pPr>
-          </w:p>
-        </w:tc>
-        <w:sdt>
-          <w:sdtPr>
-            <w:alias w:val="Enter our reference"/>
-            <w:tag w:val="OurRef"/>
-            <w:id w:val="2029136660"/>
-            <w:placeholder>
-              <w:docPart w:val="3510DCF10A6A4C7C9B4E0A2E7D9A5C98"/>
-            </w:placeholder>
-            <w:temporary/>
-            <w:showingPlcHdr/>
-            <w15:color w:val="FF99CC"/>
-          </w:sdtPr>
-          <w:sdtContent>
-            <w:tc>
-              <w:tcPr>
-                <w:tcW w:w="2552" w:type="dxa"/>
-              </w:tcPr>
-              <w:p>
-                <w:pPr>
-                  <w:pStyle w:val="LetterRefs"/>
-                  <w:spacing w:before="20" w:after="40"/>
-                </w:pPr>
-                <w:r>
-                  <w:rPr>
-                    <w:rStyle w:val="PlaceholderText"/>
-                    <w:vanish/>
-                  </w:rPr>
-                  <w:t>Click or tap here to enter text.</w:t>
-                </w:r>
-              </w:p>
-            </w:tc>
-          </w:sdtContent>
-        </w:sdt>
-        <w:tc>
-          <w:tcPr>
-            <w:tcW w:w="992" w:type="dxa"/>
-          </w:tcPr>
-          <w:p>
-            <w:pPr>
-              <w:pStyle w:val="LetterAddressText"/>
-              <w:spacing w:before="20" w:after="40"/>
-              <w:jc w:val="right"/>
-              <w:rPr>
-                <w:sz w:val="16"/>
-                <w:szCs w:val="16"/>
-              </w:rPr>
-            </w:pPr>
-          </w:p>
-        </w:tc>
-      </w:tr>
-      <w:tr>
-        <w:trPr>
-          <w:gridAfter w:val="2"/>
-          <w:wAfter w:w="3544" w:type="dxa"/>
-        </w:trPr>
-        <w:tc>
-          <w:tcPr>
-            <w:tcW w:w="5671" w:type="dxa"/>
-            <w:vMerge/>
-          </w:tcPr>
-          <w:p>
-            <w:pPr>
-              <w:pStyle w:val="LetterAddressText"/>
-            </w:pPr>
-          </w:p>
-        </w:tc>
-        <w:tc>
-          <w:tcPr>
-            <w:tcW w:w="283" w:type="dxa"/>
-          </w:tcPr>
-          <w:p>
-            <w:pPr>
-              <w:pStyle w:val="LetterRefs"/>
-            </w:pPr>
-          </w:p>
-        </w:tc>
-        <w:tc>
-          <w:tcPr>
-            <w:tcW w:w="2552" w:type="dxa"/>
-          </w:tcPr>
-          <w:sdt>
-            <w:sdtPr>
-              <w:alias w:val="Enter their reference"/>
-              <w:tag w:val="TheirRef"/>
-              <w:id w:val="745379184"/>
-              <w:placeholder>
-                <w:docPart w:val="AC0A03EB40B248728588566F5B037191"/>
-              </w:placeholder>
-              <w:temporary/>
-              <w:showingPlcHdr/>
-              <w15:color w:val="FF99CC"/>
-            </w:sdtPr>
-            <w:sdtContent>
-              <w:p>
-                <w:pPr>
-                  <w:pStyle w:val="LetterRefs"/>
-                  <w:spacing w:before="20" w:after="40"/>
-                </w:pPr>
-                <w:r>
-                  <w:rPr>
-                    <w:rStyle w:val="PlaceholderText"/>
-                    <w:vanish/>
-                  </w:rPr>
-                  <w:t>Click or tap here to enter text.</w:t>
-                </w:r>
-              </w:p>
-            </w:sdtContent>
-          </w:sdt>
-        </w:tc>
-        <w:tc>
-          <w:tcPr>
-            <w:tcW w:w="992" w:type="dxa"/>
-          </w:tcPr>
-          <w:p>
-            <w:pPr>
-              <w:pStyle w:val="LetterAddressText"/>
-              <w:spacing w:before="20" w:after="40"/>
-              <w:jc w:val="right"/>
-              <w:rPr>
-                <w:sz w:val="16"/>
-                <w:szCs w:val="16"/>
-              </w:rPr>
-            </w:pPr>
-          </w:p>
-        </w:tc>
-      </w:tr>
-      <w:tr>
-        <w:trPr>
-          <w:gridAfter w:val="2"/>
-          <w:wAfter w:w="3544" w:type="dxa"/>
-        </w:trPr>
-        <w:tc>
-          <w:tcPr>
-            <w:tcW w:w="5671" w:type="dxa"/>
-            <w:vMerge/>
-          </w:tcPr>
-          <w:p>
-            <w:pPr>
-              <w:pStyle w:val="LetterAddressText"/>
-            </w:pPr>
-          </w:p>
-        </w:tc>
-        <w:tc>
-          <w:tcPr>
-            <w:tcW w:w="283" w:type="dxa"/>
-          </w:tcPr>
-          <w:p>
-            <w:pPr>
-              <w:pStyle w:val="LetterRefs"/>
-            </w:pPr>
-          </w:p>
-        </w:tc>
-        <w:sdt>
-          <w:sdtPr>
-            <w:alias w:val="Enter letter date"/>
-            <w:tag w:val="Date"/>
-            <w:id w:val="-1578431714"/>
-            <w:placeholder>
-              <w:docPart w:val="C4070BBB73EF4223B2448ADDBECA9259"/>
-            </w:placeholder>
-            <w15:color w:val="FF99CC"/>
-            <w:date w:fullDate="2026-03-06T00:00:00Z">
-              <w:dateFormat w:val="dd MMMM yyyy"/>
-              <w:lid w:val="en-ZA"/>
-              <w:storeMappedDataAs w:val="dateTime"/>
-              <w:calendar w:val="gregorian"/>
-            </w:date>
-          </w:sdtPr>
-          <w:sdtContent>
-            <w:tc>
-              <w:tcPr>
-                <w:tcW w:w="2552" w:type="dxa"/>
-              </w:tcPr>
-              <w:p>
-                <w:pPr>
-                  <w:pStyle w:val="LetterRefs"/>
-                  <w:spacing w:before="20" w:after="40"/>
-                </w:pPr>
-                <w:r>
-                  <w:t>06 March 2026</w:t>
-                </w:r>
-              </w:p>
-            </w:tc>
-          </w:sdtContent>
-        </w:sdt>
-        <w:tc>
-          <w:tcPr>
-            <w:tcW w:w="992" w:type="dxa"/>
-          </w:tcPr>
-          <w:p>
-            <w:pPr>
-              <w:pStyle w:val="LetterAddressText"/>
-              <w:spacing w:before="20" w:after="40"/>
-              <w:jc w:val="right"/>
-              <w:rPr>
-                <w:sz w:val="16"/>
-                <w:szCs w:val="16"/>
-              </w:rPr>
-            </w:pPr>
-          </w:p>
-        </w:tc>
-      </w:tr>
-      <w:tr>
-        <w:trPr>
-          <w:gridAfter w:val="2"/>
-          <w:wAfter w:w="3544" w:type="dxa"/>
-          <w:trHeight w:val="575"/>
-        </w:trPr>
-        <w:tc>
-          <w:tcPr>
-            <w:tcW w:w="5671" w:type="dxa"/>
-            <w:vMerge/>
-          </w:tcPr>
-          <w:p>
-            <w:pPr>
-              <w:pStyle w:val="LetterAddressText"/>
-            </w:pPr>
-          </w:p>
-        </w:tc>
-        <w:tc>
-          <w:tcPr>
-            <w:tcW w:w="283" w:type="dxa"/>
-          </w:tcPr>
-          <w:p>
-            <w:pPr>
-              <w:pStyle w:val="LetterRefs"/>
-            </w:pPr>
-          </w:p>
-        </w:tc>
-        <w:sdt>
-          <w:sdtPr>
-            <w:alias w:val="Select or Enter the Delivery Method"/>
-            <w:tag w:val="Delivery"/>
-            <w:id w:val="1426842813"/>
-            <w:placeholder>
-              <w:docPart w:val="1F5D03E2B0F240F6ADDED37C8DBB040A"/>
-            </w:placeholder>
-            <w15:color w:val="FF99CC"/>
-            <w:comboBox>
-              <w:listItem w:displayText="Per Email" w:value="Per Email"/>
-              <w:listItem w:displayText="By Hand" w:value="By Hand"/>
-              <w:listItem w:displayText="Per Registered Post" w:value="Per Registered Post"/>
-              <w:listItem w:value="                   "/>
-            </w:comboBox>
-          </w:sdtPr>
-          <w:sdtContent>
-            <w:tc>
-              <w:tcPr>
-                <w:tcW w:w="2552" w:type="dxa"/>
-              </w:tcPr>
-              <w:p>
-                <w:pPr>
-                  <w:pStyle w:val="LetterRefs"/>
-                  <w:spacing w:before="20" w:after="40"/>
-                </w:pPr>
-                <w:r>
-                  <w:t>Per Email</w:t>
-                </w:r>
-              </w:p>
-            </w:tc>
-          </w:sdtContent>
-        </w:sdt>
-        <w:tc>
-          <w:tcPr>
-            <w:tcW w:w="992" w:type="dxa"/>
-          </w:tcPr>
-          <w:p>
-            <w:pPr>
-              <w:pStyle w:val="LetterAddressText"/>
-              <w:spacing w:before="20" w:after="40"/>
-              <w:jc w:val="right"/>
-              <w:rPr>
-                <w:sz w:val="16"/>
-                <w:szCs w:val="16"/>
-              </w:rPr>
-            </w:pPr>
-          </w:p>
-        </w:tc>
-      </w:tr>
-      <w:tr>
         <w:tc>
           <w:tcPr>
             <w:tcW w:w="9498" w:type="dxa"/>
-            <w:gridSpan w:val="4"/>
             <w:vMerge w:val="restart"/>
           </w:tcPr>
           <w:p>
@@ -399,7 +35,6 @@
             </w:pPr>
             <w:r>
               <w:rPr>
-                <w:b/>
                 <w:u w:val="single"/>
               </w:rPr>
               <w:t>RE: FORMAL REQUEST FOR REMOTE WORKING ARRANGEMENT</w:t>
@@ -410,7 +45,10 @@
               <w:pStyle w:val="LetterGreeting"/>
             </w:pPr>
             <w:r>
-              <w:t>Dear Ms Lalla</w:t>
+              <w:t xml:space="preserve">Dear </w:t>
+            </w:r>
+            <w:r>
+              <w:t>Nikita and Riona</w:t>
             </w:r>
           </w:p>
           <w:p>
@@ -427,24 +65,28 @@
                 <w:rFonts w:cs="Arial"/>
                 <w:szCs w:val="20"/>
               </w:rPr>
-              <w:t xml:space="preserve">I write to formally request approval for a remote working arrangement in terms of the firm’s Remote Working Policy dated 1 March 2024. I respectfully request permission to work from home one (1) day per week, on a day to be agreed upon with you.</w:t>
+              <w:t xml:space="preserve">I write to formally request approval for a remote working arrangement in terms of the firm’s Remote Working Policy. I believe that a remote working arrangement would allow me to be more productive, as I can begin work earlier and dedicate that additional time directly to project work, thereby increasing my available productive </w:t>
             </w:r>
-          </w:p>
-          <w:p>
-            <w:pPr>
-              <w:pStyle w:val="Level0Unnumbered"/>
-              <w:numPr>
-                <w:ilvl w:val="0"/>
-                <w:numId w:val="0"/>
-              </w:numPr>
-              <w:spacing w:after="200" w:line="276" w:lineRule="auto"/>
-            </w:pPr>
             <w:r>
               <w:rPr>
                 <w:rFonts w:cs="Arial"/>
                 <w:szCs w:val="20"/>
               </w:rPr>
-              <w:t>I confirm that I meet the eligibility criteria set out in the policy, and I address each requirement below:</w:t>
+              <w:t>hours.</w:t>
+            </w:r>
+            <w:r>
+              <w:rPr>
+                <w:rFonts w:cs="Arial"/>
+                <w:szCs w:val="20"/>
+              </w:rPr>
+              <w:t xml:space="preserve"> I</w:t>
+            </w:r>
+            <w:r>
+              <w:rPr>
+                <w:rFonts w:cs="Arial"/>
+                <w:szCs w:val="20"/>
+              </w:rPr>
+              <w:t xml:space="preserve"> meet the eligibility criteria set out in the policy, and I address each requirement below:</w:t>
             </w:r>
           </w:p>
           <w:p>
@@ -462,7 +104,15 @@
                 <w:b/>
                 <w:szCs w:val="20"/>
               </w:rPr>
-              <w:t>1. Eligibility</w:t>
+              <w:t>1</w:t>
+            </w:r>
+            <w:r>
+              <w:rPr>
+                <w:rFonts w:cs="Arial"/>
+                <w:b/>
+                <w:szCs w:val="20"/>
+              </w:rPr>
+              <w:t xml:space="preserve">. Reliable and Stable Internet Connection </w:t>
             </w:r>
           </w:p>
           <w:p>
@@ -479,7 +129,14 @@
                 <w:rFonts w:cs="Arial"/>
                 <w:szCs w:val="20"/>
               </w:rPr>
-              <w:t>I am an Associate Attorney at the firm and have completed my probationary period. Accordingly, I satisfy the eligibility requirements under paragraphs 2.2 and 2.3 of the policy.</w:t>
+              <w:t>I have access to a reliable, high-speed fibre internet connection at my home, which is sufficient to support all work-related activities</w:t>
+            </w:r>
+            <w:r>
+              <w:rPr>
+                <w:rFonts w:cs="Arial"/>
+                <w:szCs w:val="20"/>
+              </w:rPr>
+              <w:t>.</w:t>
             </w:r>
           </w:p>
           <w:p>
@@ -497,7 +154,15 @@
                 <w:b/>
                 <w:szCs w:val="20"/>
               </w:rPr>
-              <w:t>2. Reliable and Stable Internet Connection (Paragraph 2.4.1)</w:t>
+              <w:t>2</w:t>
+            </w:r>
+            <w:r>
+              <w:rPr>
+                <w:rFonts w:cs="Arial"/>
+                <w:b/>
+                <w:szCs w:val="20"/>
+              </w:rPr>
+              <w:t xml:space="preserve">. Quiet and Suitable Workspace </w:t>
             </w:r>
           </w:p>
           <w:p>
@@ -508,13 +173,17 @@
                 <w:numId w:val="0"/>
               </w:numPr>
               <w:spacing w:after="200" w:line="276" w:lineRule="auto"/>
+              <w:rPr>
+                <w:rFonts w:cs="Arial"/>
+                <w:szCs w:val="20"/>
+              </w:rPr>
             </w:pPr>
             <w:r>
               <w:rPr>
                 <w:rFonts w:cs="Arial"/>
                 <w:szCs w:val="20"/>
               </w:rPr>
-              <w:t>I have access to a reliable, high-speed fibre internet connection at my home, which is sufficient to support all work-related activities, including video conferencing and access to the firm’s systems.</w:t>
+              <w:t>I have a dedicated and quiet home office space that allows me to work without interruption.</w:t>
             </w:r>
           </w:p>
           <w:p>
@@ -532,7 +201,15 @@
                 <w:b/>
                 <w:szCs w:val="20"/>
               </w:rPr>
-              <w:t>3. Quiet and Suitable Workspace (Paragraph 2.4.2)</w:t>
+              <w:t>3</w:t>
+            </w:r>
+            <w:r>
+              <w:rPr>
+                <w:rFonts w:cs="Arial"/>
+                <w:b/>
+                <w:szCs w:val="20"/>
+              </w:rPr>
+              <w:t xml:space="preserve">. Availability During Business Hours </w:t>
             </w:r>
           </w:p>
           <w:p>
@@ -549,7 +226,28 @@
                 <w:rFonts w:cs="Arial"/>
                 <w:szCs w:val="20"/>
               </w:rPr>
-              <w:t>I have a dedicated, quiet home office space that is conducive to focused legal work and free from distractions.</w:t>
+              <w:t>I confirm that I will remain fully available during regular business hours on any remote working day and will be reachable by email</w:t>
+            </w:r>
+            <w:r>
+              <w:rPr>
+                <w:rFonts w:cs="Arial"/>
+                <w:szCs w:val="20"/>
+              </w:rPr>
+              <w:t xml:space="preserve"> or</w:t>
+            </w:r>
+            <w:r>
+              <w:rPr>
+                <w:rFonts w:cs="Arial"/>
+                <w:szCs w:val="20"/>
+              </w:rPr>
+              <w:t xml:space="preserve"> telephone</w:t>
+            </w:r>
+            <w:r>
+              <w:rPr>
+                <w:rFonts w:cs="Arial"/>
+                <w:szCs w:val="20"/>
+              </w:rPr>
+              <w:t>.</w:t>
             </w:r>
           </w:p>
           <w:p>
@@ -567,7 +265,15 @@
                 <w:b/>
                 <w:szCs w:val="20"/>
               </w:rPr>
-              <w:t>4. Availability During Business Hours (Paragraph 2.4.3)</w:t>
+              <w:t>4</w:t>
+            </w:r>
+            <w:r>
+              <w:rPr>
+                <w:rFonts w:cs="Arial"/>
+                <w:b/>
+                <w:szCs w:val="20"/>
+              </w:rPr>
+              <w:t>. Productivity and Deadlines</w:t>
             </w:r>
           </w:p>
           <w:p>
@@ -584,235 +290,14 @@
                 <w:rFonts w:cs="Arial"/>
                 <w:szCs w:val="20"/>
               </w:rPr>
-              <w:t>I confirm that I will remain fully available during regular business hours on any remote working day and will be reachable by email, telephone, and any other communication channels used by the firm.</w:t>
+              <w:t>I am committed to maintaining the same level of productivity, quality of work, and adherence to deadlines while working remotely.</w:t>
             </w:r>
-          </w:p>
-          <w:p>
-            <w:pPr>
-              <w:pStyle w:val="Level0Unnumbered"/>
-              <w:numPr>
-                <w:ilvl w:val="0"/>
-                <w:numId w:val="0"/>
-              </w:numPr>
-              <w:spacing w:after="200" w:line="276" w:lineRule="auto"/>
-            </w:pPr>
-            <w:r>
-              <w:rPr>
-                <w:rFonts w:cs="Arial"/>
-                <w:b/>
-                <w:szCs w:val="20"/>
-              </w:rPr>
-              <w:t>5. Productivity and Deadlines (Paragraphs 2.4.4 and 2.4.5)</w:t>
-            </w:r>
-          </w:p>
-          <w:p>
-            <w:pPr>
-              <w:pStyle w:val="Level0Unnumbered"/>
-              <w:numPr>
-                <w:ilvl w:val="0"/>
-                <w:numId w:val="0"/>
-              </w:numPr>
-              <w:spacing w:after="200" w:line="276" w:lineRule="auto"/>
-            </w:pPr>
             <w:r>
               <w:rPr>
                 <w:rFonts w:cs="Arial"/>
                 <w:szCs w:val="20"/>
               </w:rPr>
-              <w:t>I am committed to maintaining the same level of productivity and quality of work while working remotely. I will ensure that all deadlines are met and that my overall deliverables for both billable and non-billable work continue to be fulfilled.</w:t>
-            </w:r>
-          </w:p>
-          <w:p>
-            <w:pPr>
-              <w:pStyle w:val="Level0Unnumbered"/>
-              <w:numPr>
-                <w:ilvl w:val="0"/>
-                <w:numId w:val="0"/>
-              </w:numPr>
-              <w:spacing w:after="200" w:line="276" w:lineRule="auto"/>
-            </w:pPr>
-            <w:r>
-              <w:rPr>
-                <w:rFonts w:cs="Arial"/>
-                <w:b/>
-                <w:szCs w:val="20"/>
-              </w:rPr>
-              <w:t>6. Essential Resources (Paragraph 4)</w:t>
-            </w:r>
-          </w:p>
-          <w:p>
-            <w:pPr>
-              <w:pStyle w:val="Level0Unnumbered"/>
-              <w:numPr>
-                <w:ilvl w:val="0"/>
-                <w:numId w:val="0"/>
-              </w:numPr>
-              <w:spacing w:after="200" w:line="276" w:lineRule="auto"/>
-            </w:pPr>
-            <w:r>
-              <w:rPr>
-                <w:rFonts w:cs="Arial"/>
-                <w:szCs w:val="20"/>
-              </w:rPr>
-              <w:t>I confirm that I have the following essential resources available at my home:</w:t>
-            </w:r>
-          </w:p>
-          <w:p>
-            <w:pPr>
-              <w:pStyle w:val="Level0Unnumbered"/>
-              <w:numPr>
-                <w:ilvl w:val="0"/>
-                <w:numId w:val="0"/>
-              </w:numPr>
-              <w:spacing w:after="100" w:line="276" w:lineRule="auto"/>
-              <w:ind w:left="720"/>
-            </w:pPr>
-            <w:r>
-              <w:rPr>
-                <w:rFonts w:cs="Arial"/>
-                <w:szCs w:val="20"/>
-              </w:rPr>
-              <w:t>6.1. A reliable high-speed internet connection;</w:t>
-            </w:r>
-          </w:p>
-          <w:p>
-            <w:pPr>
-              <w:pStyle w:val="Level0Unnumbered"/>
-              <w:numPr>
-                <w:ilvl w:val="0"/>
-                <w:numId w:val="0"/>
-              </w:numPr>
-              <w:spacing w:after="100" w:line="276" w:lineRule="auto"/>
-              <w:ind w:left="720"/>
-            </w:pPr>
-            <w:r>
-              <w:rPr>
-                <w:rFonts w:cs="Arial"/>
-                <w:szCs w:val="20"/>
-              </w:rPr>
-              <w:t>6.2. Adequate computer equipment;</w:t>
-            </w:r>
-          </w:p>
-          <w:p>
-            <w:pPr>
-              <w:pStyle w:val="Level0Unnumbered"/>
-              <w:numPr>
-                <w:ilvl w:val="0"/>
-                <w:numId w:val="0"/>
-              </w:numPr>
-              <w:spacing w:after="100" w:line="276" w:lineRule="auto"/>
-              <w:ind w:left="720"/>
-            </w:pPr>
-            <w:r>
-              <w:rPr>
-                <w:rFonts w:cs="Arial"/>
-                <w:szCs w:val="20"/>
-              </w:rPr>
-              <w:t>6.3. An uninterrupted power supply; and</w:t>
-            </w:r>
-          </w:p>
-          <w:p>
-            <w:pPr>
-              <w:pStyle w:val="Level0Unnumbered"/>
-              <w:numPr>
-                <w:ilvl w:val="0"/>
-                <w:numId w:val="0"/>
-              </w:numPr>
-              <w:spacing w:after="200" w:line="276" w:lineRule="auto"/>
-              <w:ind w:left="720"/>
-            </w:pPr>
-            <w:r>
-              <w:rPr>
-                <w:rFonts w:cs="Arial"/>
-                <w:szCs w:val="20"/>
-              </w:rPr>
-              <w:t>6.4. Access to all necessary case files and legal materials via the firm’s systems.</w:t>
-            </w:r>
-          </w:p>
-          <w:p>
-            <w:pPr>
-              <w:pStyle w:val="Level0Unnumbered"/>
-              <w:numPr>
-                <w:ilvl w:val="0"/>
-                <w:numId w:val="0"/>
-              </w:numPr>
-              <w:spacing w:after="200" w:line="276" w:lineRule="auto"/>
-            </w:pPr>
-            <w:r>
-              <w:rPr>
-                <w:rFonts w:cs="Arial"/>
-                <w:b/>
-                <w:szCs w:val="20"/>
-              </w:rPr>
-              <w:t>7. Compliance and Communication (Paragraphs 5 and 8)</w:t>
-            </w:r>
-          </w:p>
-          <w:p>
-            <w:pPr>
-              <w:pStyle w:val="Level0Unnumbered"/>
-              <w:numPr>
-                <w:ilvl w:val="0"/>
-                <w:numId w:val="0"/>
-              </w:numPr>
-              <w:spacing w:after="200" w:line="276" w:lineRule="auto"/>
-            </w:pPr>
-            <w:r>
-              <w:rPr>
-                <w:rFonts w:cs="Arial"/>
-                <w:szCs w:val="20"/>
-              </w:rPr>
-              <w:t>I undertake to adhere to all firm policies and procedures, including confidentiality and information security protocols, while working remotely. I further undertake to maintain regular check-ins with supervisors and team members and to fulfil all obligations to my team and clients, including regular communication and timely responses.</w:t>
-            </w:r>
-          </w:p>
-          <w:p>
-            <w:pPr>
-              <w:pStyle w:val="Level0Unnumbered"/>
-              <w:numPr>
-                <w:ilvl w:val="0"/>
-                <w:numId w:val="0"/>
-              </w:numPr>
-              <w:spacing w:after="200" w:line="276" w:lineRule="auto"/>
-            </w:pPr>
-            <w:r>
-              <w:rPr>
-                <w:rFonts w:cs="Arial"/>
-                <w:szCs w:val="20"/>
-              </w:rPr>
-              <w:t>I acknowledge that this arrangement is subject to the firm’s discretion, periodic review, and may be adjusted or revoked based on the evolving needs of the firm and my compliance with the policy.</w:t>
-            </w:r>
-          </w:p>
-          <w:p>
-            <w:pPr>
-              <w:pStyle w:val="Level0Unnumbered"/>
-              <w:numPr>
-                <w:ilvl w:val="0"/>
-                <w:numId w:val="0"/>
-              </w:numPr>
-              <w:spacing w:after="200" w:line="276" w:lineRule="auto"/>
-            </w:pPr>
-            <w:r>
-              <w:rPr>
-                <w:rFonts w:cs="Arial"/>
-                <w:szCs w:val="20"/>
-              </w:rPr>
-              <w:t>I would welcome the opportunity to discuss this request with you at your earliest convenience. Should any additional information be required, I am happy to provide it.</w:t>
-            </w:r>
-          </w:p>
-          <w:p>
-            <w:pPr>
-              <w:pStyle w:val="Level0Unnumbered"/>
-              <w:numPr>
-                <w:ilvl w:val="0"/>
-                <w:numId w:val="0"/>
-              </w:numPr>
-              <w:spacing w:after="200" w:line="276" w:lineRule="auto"/>
-            </w:pPr>
-            <w:r>
-              <w:rPr>
-                <w:rFonts w:cs="Arial"/>
-                <w:szCs w:val="20"/>
-              </w:rPr>
-              <w:t>Thank you for your consideration.</w:t>
+              <w:t xml:space="preserve"> </w:t>
             </w:r>
           </w:p>
           <w:p>
@@ -820,34 +305,35 @@
               <w:pStyle w:val="LetterEnding"/>
             </w:pPr>
             <w:r>
-              <w:t>Yours faithfully</w:t>
+              <w:t>Kind regards,</w:t>
             </w:r>
           </w:p>
           <w:p>
             <w:pPr>
-              <w:pStyle w:val="LetterClose"/>
+              <w:spacing w:after="0" w:line="240" w:lineRule="auto"/>
+              <w:rPr>
+                <w:lang w:eastAsia="en-ZA"/>
+              </w:rPr>
             </w:pPr>
             <w:r>
               <w:rPr>
-                <w:b/>
+                <w:lang w:eastAsia="en-ZA"/>
               </w:rPr>
-              <w:t>DELANO MARTIN</w:t>
+              <w:t>Delano Martin</w:t>
             </w:r>
           </w:p>
           <w:p>
             <w:pPr>
-              <w:pStyle w:val="LetterClose"/>
+              <w:spacing w:after="0" w:line="240" w:lineRule="auto"/>
+              <w:rPr>
+                <w:lang w:eastAsia="en-ZA"/>
+              </w:rPr>
             </w:pPr>
             <w:r>
-              <w:t>Associate Attorney</w:t>
-            </w:r>
-          </w:p>
-          <w:p>
-            <w:pPr>
-              <w:pStyle w:val="LetterClose"/>
-            </w:pPr>
-            <w:r>
-              <w:t>LNP Beyond Legal</w:t>
+              <w:rPr>
+                <w:lang w:eastAsia="en-ZA"/>
+              </w:rPr>
+              <w:t>Junior Software Engineer</w:t>
             </w:r>
           </w:p>
         </w:tc>
@@ -890,7 +376,6 @@
         <w:tc>
           <w:tcPr>
             <w:tcW w:w="9498" w:type="dxa"/>
-            <w:gridSpan w:val="4"/>
             <w:vMerge/>
           </w:tcPr>
           <w:p>
@@ -947,7 +432,6 @@
         <w:tc>
           <w:tcPr>
             <w:tcW w:w="9498" w:type="dxa"/>
-            <w:gridSpan w:val="4"/>
             <w:vMerge/>
           </w:tcPr>
           <w:p>
@@ -13322,6 +12806,9 @@
   <w:num w:numId="88" w16cid:durableId="182137740">
     <w:abstractNumId w:val="9"/>
   </w:num>
+  <w:num w:numId="89" w16cid:durableId="538787904">
+    <w:abstractNumId w:val="1"/>
+  </w:num>
   <w:numIdMacAtCleanup w:val="82"/>
 </w:numbering>
 </file>
@@ -13973,7 +13460,6 @@
   <w:style w:type="character" w:default="1" w:styleId="DefaultParagraphFont">
     <w:name w:val="Default Paragraph Font"/>
     <w:uiPriority w:val="1"/>
-    <w:semiHidden/>
     <w:unhideWhenUsed/>
   </w:style>
   <w:style w:type="table" w:default="1" w:styleId="TableNormal">
@@ -18248,826 +17734,6 @@
     </w:rPr>
   </w:style>
 </w:styles>
-</file>
-
-<file path=word/glossary/document.xml><?xml version="1.0" encoding="utf-8"?>
-<w:glossaryDocument xmlns:wpc="http://schemas.microsoft.com/office/word/2010/wordprocessingCanvas" xmlns:cx="http://schemas.microsoft.com/office/drawing/2014/chartex" xmlns:cx1="http://schemas.microsoft.com/office/drawing/2015/9/8/chartex" xmlns:cx2="http://schemas.microsoft.com/office/drawing/2015/10/21/chartex" xmlns:cx3="http://schemas.microsoft.com/office/drawing/2016/5/9/chartex" xmlns:cx4="http://schemas.microsoft.com/office/drawing/2016/5/10/chartex" xmlns:cx5="http://schemas.microsoft.com/office/drawing/2016/5/11/chartex" xmlns:cx6="http://schemas.microsoft.com/office/drawing/2016/5/12/chartex" xmlns:cx7="http://schemas.microsoft.com/office/drawing/2016/5/13/chartex" xmlns:cx8="http://schemas.microsoft.com/office/drawing/2016/5/14/chartex" xmlns:mc="http://schemas.openxmlformats.org/markup-compatibility/2006" xmlns:aink="http://schemas.microsoft.com/office/drawing/2016/ink" xmlns:am3d="http://schemas.microsoft.com/office/drawing/2017/model3d" xmlns:o="urn:schemas-microsoft-com:office:office" xmlns:oel="http://schemas.microsoft.com/office/2019/extlst" xmlns:r="http://schemas.openxmlformats.org/officeDocument/2006/relationships" xmlns:m="http://schemas.openxmlformats.org/officeDocument/2006/math" xmlns:v="urn:schemas-microsoft-com:vml" xmlns:wp14="http://schemas.microsoft.com/office/word/2010/wordprocessingDrawing" xmlns:wp="http://schemas.openxmlformats.org/drawingml/2006/wordprocessingDrawing" xmlns:w10="urn:schemas-microsoft-com:office:word" xmlns:w="http://schemas.openxmlformats.org/wordprocessingml/2006/main" xmlns:w14="http://schemas.microsoft.com/office/word/2010/wordml" xmlns:w15="http://schemas.microsoft.com/office/word/2012/wordml" xmlns:w16cex="http://schemas.microsoft.com/office/word/2018/wordml/cex" xmlns:w16cid="http://schemas.microsoft.com/office/word/2016/wordml/cid" xmlns:w16="http://schemas.microsoft.com/office/word/2018/wordml" xmlns:w16du="http://schemas.microsoft.com/office/word/2023/wordml/word16du" xmlns:w16sdtdh="http://schemas.microsoft.com/office/word/2020/wordml/sdtdatahash" xmlns:w16sdtfl="http://schemas.microsoft.com/office/word/2024/wordml/sdtformatlock" xmlns:w16se="http://schemas.microsoft.com/office/word/2015/wordml/symex" xmlns:wpg="http://schemas.microsoft.com/office/word/2010/wordprocessingGroup" xmlns:wpi="http://schemas.microsoft.com/office/word/2010/wordprocessingInk" xmlns:wne="http://schemas.microsoft.com/office/word/2006/wordml" xmlns:wps="http://schemas.microsoft.com/office/word/2010/wordprocessingShape" mc:Ignorable="w14 w15 w16se w16cid w16 w16cex w16sdtdh w16sdtfl w16du wp14">
-  <w:docParts>
-    <w:docPart>
-      <w:docPartPr>
-        <w:name w:val="1C8175ADAE644306BD623AA062986D0A"/>
-        <w:category>
-          <w:name w:val="General"/>
-          <w:gallery w:val="placeholder"/>
-        </w:category>
-        <w:types>
-          <w:type w:val="bbPlcHdr"/>
-        </w:types>
-        <w:behaviors>
-          <w:behavior w:val="content"/>
-        </w:behaviors>
-        <w:guid w:val="{5E408782-7719-4D7B-B33B-46EB2846E2D8}"/>
-      </w:docPartPr>
-      <w:docPartBody>
-        <w:p>
-          <w:pPr>
-            <w:pStyle w:val="1C8175ADAE644306BD623AA062986D0A"/>
-          </w:pPr>
-          <w:r>
-            <w:rPr>
-              <w:rStyle w:val="PlaceholderText"/>
-              <w:vanish/>
-            </w:rPr>
-            <w:t>Click or tap here to enter text.</w:t>
-          </w:r>
-        </w:p>
-      </w:docPartBody>
-    </w:docPart>
-    <w:docPart>
-      <w:docPartPr>
-        <w:name w:val="6E04C38900AD4D7EA1D77BC74B787406"/>
-        <w:category>
-          <w:name w:val="General"/>
-          <w:gallery w:val="placeholder"/>
-        </w:category>
-        <w:types>
-          <w:type w:val="bbPlcHdr"/>
-        </w:types>
-        <w:behaviors>
-          <w:behavior w:val="content"/>
-        </w:behaviors>
-        <w:guid w:val="{E5E750B2-7BCC-4D5F-9277-808EEECF4A43}"/>
-      </w:docPartPr>
-      <w:docPartBody>
-        <w:p>
-          <w:pPr>
-            <w:pStyle w:val="6E04C38900AD4D7EA1D77BC74B787406"/>
-          </w:pPr>
-          <w:r>
-            <w:rPr>
-              <w:rStyle w:val="PlaceholderText"/>
-              <w:vanish/>
-            </w:rPr>
-            <w:t>Click or tap here to enter text.</w:t>
-          </w:r>
-        </w:p>
-      </w:docPartBody>
-    </w:docPart>
-    <w:docPart>
-      <w:docPartPr>
-        <w:name w:val="3510DCF10A6A4C7C9B4E0A2E7D9A5C98"/>
-        <w:category>
-          <w:name w:val="General"/>
-          <w:gallery w:val="placeholder"/>
-        </w:category>
-        <w:types>
-          <w:type w:val="bbPlcHdr"/>
-        </w:types>
-        <w:behaviors>
-          <w:behavior w:val="content"/>
-        </w:behaviors>
-        <w:guid w:val="{B2D20F68-E6E8-43D8-AFF1-5B86DCC352A6}"/>
-      </w:docPartPr>
-      <w:docPartBody>
-        <w:p>
-          <w:pPr>
-            <w:pStyle w:val="3510DCF10A6A4C7C9B4E0A2E7D9A5C98"/>
-          </w:pPr>
-          <w:r>
-            <w:rPr>
-              <w:rStyle w:val="PlaceholderText"/>
-              <w:vanish/>
-            </w:rPr>
-            <w:t>Click or tap here to enter text.</w:t>
-          </w:r>
-        </w:p>
-      </w:docPartBody>
-    </w:docPart>
-    <w:docPart>
-      <w:docPartPr>
-        <w:name w:val="AC0A03EB40B248728588566F5B037191"/>
-        <w:category>
-          <w:name w:val="General"/>
-          <w:gallery w:val="placeholder"/>
-        </w:category>
-        <w:types>
-          <w:type w:val="bbPlcHdr"/>
-        </w:types>
-        <w:behaviors>
-          <w:behavior w:val="content"/>
-        </w:behaviors>
-        <w:guid w:val="{E0E2B99F-7F52-4F94-83A3-773080E22E4E}"/>
-      </w:docPartPr>
-      <w:docPartBody>
-        <w:p>
-          <w:pPr>
-            <w:pStyle w:val="AC0A03EB40B248728588566F5B037191"/>
-          </w:pPr>
-          <w:r>
-            <w:rPr>
-              <w:rStyle w:val="PlaceholderText"/>
-              <w:vanish/>
-            </w:rPr>
-            <w:t>Click or tap here to enter text.</w:t>
-          </w:r>
-        </w:p>
-      </w:docPartBody>
-    </w:docPart>
-    <w:docPart>
-      <w:docPartPr>
-        <w:name w:val="C4070BBB73EF4223B2448ADDBECA9259"/>
-        <w:category>
-          <w:name w:val="General"/>
-          <w:gallery w:val="placeholder"/>
-        </w:category>
-        <w:types>
-          <w:type w:val="bbPlcHdr"/>
-        </w:types>
-        <w:behaviors>
-          <w:behavior w:val="content"/>
-        </w:behaviors>
-        <w:guid w:val="{95122230-406F-4B10-9202-D73264A20F74}"/>
-      </w:docPartPr>
-      <w:docPartBody>
-        <w:p>
-          <w:pPr>
-            <w:pStyle w:val="C4070BBB73EF4223B2448ADDBECA9259"/>
-          </w:pPr>
-          <w:r>
-            <w:t>                        </w:t>
-          </w:r>
-        </w:p>
-      </w:docPartBody>
-    </w:docPart>
-    <w:docPart>
-      <w:docPartPr>
-        <w:name w:val="1F5D03E2B0F240F6ADDED37C8DBB040A"/>
-        <w:category>
-          <w:name w:val="General"/>
-          <w:gallery w:val="placeholder"/>
-        </w:category>
-        <w:types>
-          <w:type w:val="bbPlcHdr"/>
-        </w:types>
-        <w:behaviors>
-          <w:behavior w:val="content"/>
-        </w:behaviors>
-        <w:guid w:val="{BEB43BEF-7A2D-42A5-A12C-7E2AD64DC12B}"/>
-      </w:docPartPr>
-      <w:docPartBody>
-        <w:p>
-          <w:pPr>
-            <w:pStyle w:val="1F5D03E2B0F240F6ADDED37C8DBB040A"/>
-          </w:pPr>
-          <w:r>
-            <w:rPr>
-              <w:rStyle w:val="PlaceholderText"/>
-              <w:vanish/>
-            </w:rPr>
-            <w:t>Choose an item.</w:t>
-          </w:r>
-        </w:p>
-      </w:docPartBody>
-    </w:docPart>
-  </w:docParts>
-</w:glossaryDocument>
-</file>
-
-<file path=word/glossary/fontTable.xml><?xml version="1.0" encoding="utf-8"?>
-<w:fonts xmlns:mc="http://schemas.openxmlformats.org/markup-compatibility/2006" xmlns:r="http://schemas.openxmlformats.org/officeDocument/2006/relationships" xmlns:w="http://schemas.openxmlformats.org/wordprocessingml/2006/main" xmlns:w14="http://schemas.microsoft.com/office/word/2010/wordml" xmlns:w15="http://schemas.microsoft.com/office/word/2012/wordml" xmlns:w16cex="http://schemas.microsoft.com/office/word/2018/wordml/cex" xmlns:w16cid="http://schemas.microsoft.com/office/word/2016/wordml/cid" xmlns:w16="http://schemas.microsoft.com/office/word/2018/wordml" xmlns:w16du="http://schemas.microsoft.com/office/word/2023/wordml/word16du" xmlns:w16sdtdh="http://schemas.microsoft.com/office/word/2020/wordml/sdtdatahash" xmlns:w16sdtfl="http://schemas.microsoft.com/office/word/2024/wordml/sdtformatlock" xmlns:w16se="http://schemas.microsoft.com/office/word/2015/wordml/symex" mc:Ignorable="w14 w15 w16se w16cid w16 w16cex w16sdtdh w16sdtfl w16du">
-  <w:font w:name="Symbol">
-    <w:panose1 w:val="05050102010706020507"/>
-    <w:charset w:val="02"/>
-    <w:family w:val="roman"/>
-    <w:pitch w:val="variable"/>
-    <w:sig w:usb0="00000000" w:usb1="10000000" w:usb2="00000000" w:usb3="00000000" w:csb0="80000000" w:csb1="00000000"/>
-  </w:font>
-  <w:font w:name="Times New Roman">
-    <w:panose1 w:val="02020603050405020304"/>
-    <w:charset w:val="00"/>
-    <w:family w:val="roman"/>
-    <w:pitch w:val="variable"/>
-    <w:sig w:usb0="E0002EFF" w:usb1="C000785B" w:usb2="00000009" w:usb3="00000000" w:csb0="000001FF" w:csb1="00000000"/>
-  </w:font>
-  <w:font w:name="Arial">
-    <w:panose1 w:val="020B0604020202020204"/>
-    <w:charset w:val="00"/>
-    <w:family w:val="swiss"/>
-    <w:pitch w:val="variable"/>
-    <w:sig w:usb0="E0002EFF" w:usb1="C000785B" w:usb2="00000009" w:usb3="00000000" w:csb0="000001FF" w:csb1="00000000"/>
-  </w:font>
-  <w:font w:name="Courier New">
-    <w:panose1 w:val="02070309020205020404"/>
-    <w:charset w:val="00"/>
-    <w:family w:val="modern"/>
-    <w:pitch w:val="fixed"/>
-    <w:sig w:usb0="E0002EFF" w:usb1="C0007843" w:usb2="00000009" w:usb3="00000000" w:csb0="000001FF" w:csb1="00000000"/>
-  </w:font>
-  <w:font w:name="Wingdings">
-    <w:panose1 w:val="05000000000000000000"/>
-    <w:charset w:val="02"/>
-    <w:family w:val="auto"/>
-    <w:pitch w:val="variable"/>
-    <w:sig w:usb0="00000000" w:usb1="10000000" w:usb2="00000000" w:usb3="00000000" w:csb0="80000000" w:csb1="00000000"/>
-  </w:font>
-  <w:font w:name="Calibri">
-    <w:panose1 w:val="020F0502020204030204"/>
-    <w:charset w:val="00"/>
-    <w:family w:val="swiss"/>
-    <w:pitch w:val="variable"/>
-    <w:sig w:usb0="E4002EFF" w:usb1="C200247B" w:usb2="00000009" w:usb3="00000000" w:csb0="000001FF" w:csb1="00000000"/>
-  </w:font>
-  <w:font w:name="MS Mincho">
-    <w:altName w:val="ＭＳ 明朝"/>
-    <w:panose1 w:val="02020609040205080304"/>
-    <w:charset w:val="80"/>
-    <w:family w:val="modern"/>
-    <w:pitch w:val="fixed"/>
-    <w:sig w:usb0="E00002FF" w:usb1="6AC7FDFB" w:usb2="08000012" w:usb3="00000000" w:csb0="0002009F" w:csb1="00000000"/>
-  </w:font>
-  <w:font w:name="Cambria">
-    <w:panose1 w:val="02040503050406030204"/>
-    <w:charset w:val="00"/>
-    <w:family w:val="roman"/>
-    <w:pitch w:val="variable"/>
-    <w:sig w:usb0="E00006FF" w:usb1="420024FF" w:usb2="02000000" w:usb3="00000000" w:csb0="0000019F" w:csb1="00000000"/>
-  </w:font>
-  <w:font w:name="Verdana">
-    <w:panose1 w:val="020B0604030504040204"/>
-    <w:charset w:val="00"/>
-    <w:family w:val="swiss"/>
-    <w:pitch w:val="variable"/>
-    <w:sig w:usb0="A00006FF" w:usb1="4000205B" w:usb2="00000010" w:usb3="00000000" w:csb0="0000019F" w:csb1="00000000"/>
-  </w:font>
-  <w:font w:name="Avenir Book">
-    <w:altName w:val="Tw Cen MT"/>
-    <w:charset w:val="00"/>
-    <w:family w:val="auto"/>
-    <w:pitch w:val="variable"/>
-    <w:sig w:usb0="800000AF" w:usb1="5000204A" w:usb2="00000000" w:usb3="00000000" w:csb0="0000009B" w:csb1="00000000"/>
-  </w:font>
-  <w:font w:name="Arial Bold">
-    <w:altName w:val="Arial"/>
-    <w:panose1 w:val="00000000000000000000"/>
-    <w:charset w:val="00"/>
-    <w:family w:val="swiss"/>
-    <w:notTrueType/>
-    <w:pitch w:val="default"/>
-    <w:sig w:usb0="00000003" w:usb1="00000000" w:usb2="00000000" w:usb3="00000000" w:csb0="00000001" w:csb1="00000000"/>
-  </w:font>
-  <w:font w:name="Tahoma">
-    <w:panose1 w:val="020B0604030504040204"/>
-    <w:charset w:val="00"/>
-    <w:family w:val="swiss"/>
-    <w:pitch w:val="variable"/>
-    <w:sig w:usb0="E1002EFF" w:usb1="C000605B" w:usb2="00000029" w:usb3="00000000" w:csb0="000101FF" w:csb1="00000000"/>
-  </w:font>
-  <w:font w:name="Ubuntu Medium">
-    <w:charset w:val="00"/>
-    <w:family w:val="swiss"/>
-    <w:pitch w:val="variable"/>
-    <w:sig w:usb0="E00002FF" w:usb1="5000205B" w:usb2="00000000" w:usb3="00000000" w:csb0="0000009F" w:csb1="00000000"/>
-  </w:font>
-  <w:font w:name="Aptos">
-    <w:charset w:val="00"/>
-    <w:family w:val="swiss"/>
-    <w:pitch w:val="variable"/>
-    <w:sig w:usb0="20000287" w:usb1="00000003" w:usb2="00000000" w:usb3="00000000" w:csb0="0000019F" w:csb1="00000000"/>
-  </w:font>
-  <w:font w:name="Aptos Display">
-    <w:charset w:val="00"/>
-    <w:family w:val="swiss"/>
-    <w:pitch w:val="variable"/>
-    <w:sig w:usb0="20000287" w:usb1="00000003" w:usb2="00000000" w:usb3="00000000" w:csb0="0000019F" w:csb1="00000000"/>
-  </w:font>
-</w:fonts>
-</file>
-
-<file path=word/glossary/settings.xml><?xml version="1.0" encoding="utf-8"?>
-<w:settings xmlns:mc="http://schemas.openxmlformats.org/markup-compatibility/2006" xmlns:o="urn:schemas-microsoft-com:office:office" xmlns:r="http://schemas.openxmlformats.org/officeDocument/2006/relationships" xmlns:m="http://schemas.openxmlformats.org/officeDocument/2006/math" xmlns:v="urn:schemas-microsoft-com:vml" xmlns:w10="urn:schemas-microsoft-com:office:word" xmlns:w="http://schemas.openxmlformats.org/wordprocessingml/2006/main" xmlns:w14="http://schemas.microsoft.com/office/word/2010/wordml" xmlns:w15="http://schemas.microsoft.com/office/word/2012/wordml" xmlns:w16cex="http://schemas.microsoft.com/office/word/2018/wordml/cex" xmlns:w16cid="http://schemas.microsoft.com/office/word/2016/wordml/cid" xmlns:w16="http://schemas.microsoft.com/office/word/2018/wordml" xmlns:w16du="http://schemas.microsoft.com/office/word/2023/wordml/word16du" xmlns:w16sdtdh="http://schemas.microsoft.com/office/word/2020/wordml/sdtdatahash" xmlns:w16sdtfl="http://schemas.microsoft.com/office/word/2024/wordml/sdtformatlock" xmlns:w16se="http://schemas.microsoft.com/office/word/2015/wordml/symex" xmlns:sl="http://schemas.openxmlformats.org/schemaLibrary/2006/main" mc:Ignorable="w14 w15 w16se w16cid w16 w16cex w16sdtdh w16sdtfl w16du">
-  <w:view w:val="normal"/>
-  <w:defaultTabStop w:val="720"/>
-  <w:characterSpacingControl w:val="doNotCompress"/>
-  <w:compat>
-    <w:useFELayout/>
-    <w:compatSetting w:name="compatibilityMode" w:uri="http://schemas.microsoft.com/office/word" w:val="15"/>
-    <w:compatSetting w:name="overrideTableStyleFontSizeAndJustification" w:uri="http://schemas.microsoft.com/office/word" w:val="1"/>
-    <w:compatSetting w:name="enableOpenTypeFeatures" w:uri="http://schemas.microsoft.com/office/word" w:val="1"/>
-    <w:compatSetting w:name="doNotFlipMirrorIndents" w:uri="http://schemas.microsoft.com/office/word" w:val="1"/>
-    <w:compatSetting w:name="differentiateMultirowTableHeaders" w:uri="http://schemas.microsoft.com/office/word" w:val="1"/>
-    <w:compatSetting w:name="useWord2013TrackBottomHyphenation" w:uri="http://schemas.microsoft.com/office/word" w:val="0"/>
-  </w:compat>
-  <w:rsids>
-    <w:rsidRoot w:val="00A94EA3"/>
-    <w:rsid w:val="00061350"/>
-    <w:rsid w:val="000858B7"/>
-    <w:rsid w:val="00291BB2"/>
-    <w:rsid w:val="002A51F7"/>
-    <w:rsid w:val="00343BF0"/>
-    <w:rsid w:val="00622438"/>
-    <w:rsid w:val="006576A8"/>
-    <w:rsid w:val="00657CF9"/>
-    <w:rsid w:val="007153CE"/>
-    <w:rsid w:val="008A5BB1"/>
-    <w:rsid w:val="00907B0F"/>
-    <w:rsid w:val="009B61CC"/>
-    <w:rsid w:val="00A94EA3"/>
-    <w:rsid w:val="00DD7465"/>
-    <w:rsid w:val="00E437F8"/>
-    <w:rsid w:val="00E44AC7"/>
-    <w:rsid w:val="00FA2BE8"/>
-  </w:rsids>
-  <m:mathPr>
-    <m:mathFont m:val="Cambria Math"/>
-    <m:brkBin m:val="before"/>
-    <m:brkBinSub m:val="--"/>
-    <m:smallFrac m:val="0"/>
-    <m:dispDef/>
-    <m:lMargin m:val="0"/>
-    <m:rMargin m:val="0"/>
-    <m:defJc m:val="centerGroup"/>
-    <m:wrapIndent m:val="1440"/>
-    <m:intLim m:val="subSup"/>
-    <m:naryLim m:val="undOvr"/>
-  </m:mathPr>
-  <w:themeFontLang w:val="en-ZA"/>
-  <w:clrSchemeMapping w:bg1="light1" w:t1="dark1" w:bg2="light2" w:t2="dark2" w:accent1="accent1" w:accent2="accent2" w:accent3="accent3" w:accent4="accent4" w:accent5="accent5" w:accent6="accent6" w:hyperlink="hyperlink" w:followedHyperlink="followedHyperlink"/>
-  <w:decimalSymbol w:val="."/>
-  <w:listSeparator w:val=","/>
-  <w15:chartTrackingRefBased/>
-</w:settings>
-</file>
-
-<file path=word/glossary/styles.xml><?xml version="1.0" encoding="utf-8"?>
-<w:styles xmlns:mc="http://schemas.openxmlformats.org/markup-compatibility/2006" xmlns:r="http://schemas.openxmlformats.org/officeDocument/2006/relationships" xmlns:w="http://schemas.openxmlformats.org/wordprocessingml/2006/main" xmlns:w14="http://schemas.microsoft.com/office/word/2010/wordml" xmlns:w15="http://schemas.microsoft.com/office/word/2012/wordml" xmlns:w16cex="http://schemas.microsoft.com/office/word/2018/wordml/cex" xmlns:w16cid="http://schemas.microsoft.com/office/word/2016/wordml/cid" xmlns:w16="http://schemas.microsoft.com/office/word/2018/wordml" xmlns:w16du="http://schemas.microsoft.com/office/word/2023/wordml/word16du" xmlns:w16sdtdh="http://schemas.microsoft.com/office/word/2020/wordml/sdtdatahash" xmlns:w16sdtfl="http://schemas.microsoft.com/office/word/2024/wordml/sdtformatlock" xmlns:w16se="http://schemas.microsoft.com/office/word/2015/wordml/symex" mc:Ignorable="w14 w15 w16se w16cid w16 w16cex w16sdtdh w16sdtfl w16du">
-  <w:docDefaults>
-    <w:rPrDefault>
-      <w:rPr>
-        <w:rFonts w:asciiTheme="minorHAnsi" w:eastAsiaTheme="minorEastAsia" w:hAnsiTheme="minorHAnsi" w:cstheme="minorBidi"/>
-        <w:kern w:val="2"/>
-        <w:sz w:val="24"/>
-        <w:szCs w:val="24"/>
-        <w:lang w:val="en-ZA" w:eastAsia="en-ZA" w:bidi="ar-SA"/>
-        <w14:ligatures w14:val="standardContextual"/>
-      </w:rPr>
-    </w:rPrDefault>
-    <w:pPrDefault>
-      <w:pPr>
-        <w:spacing w:after="160" w:line="278" w:lineRule="auto"/>
-      </w:pPr>
-    </w:pPrDefault>
-  </w:docDefaults>
-  <w:latentStyles w:defLockedState="0" w:defUIPriority="99" w:defSemiHidden="0" w:defUnhideWhenUsed="0" w:defQFormat="0" w:count="376">
-    <w:lsdException w:name="Normal" w:uiPriority="0" w:qFormat="1"/>
-    <w:lsdException w:name="heading 1" w:uiPriority="9" w:qFormat="1"/>
-    <w:lsdException w:name="heading 2" w:semiHidden="1" w:uiPriority="9" w:unhideWhenUsed="1" w:qFormat="1"/>
-    <w:lsdException w:name="heading 3" w:semiHidden="1" w:uiPriority="9" w:unhideWhenUsed="1" w:qFormat="1"/>
-    <w:lsdException w:name="heading 4" w:semiHidden="1" w:uiPriority="9" w:unhideWhenUsed="1" w:qFormat="1"/>
-    <w:lsdException w:name="heading 5" w:semiHidden="1" w:uiPriority="9" w:unhideWhenUsed="1" w:qFormat="1"/>
-    <w:lsdException w:name="heading 6" w:semiHidden="1" w:uiPriority="9" w:unhideWhenUsed="1" w:qFormat="1"/>
-    <w:lsdException w:name="heading 7" w:semiHidden="1" w:uiPriority="9" w:unhideWhenUsed="1" w:qFormat="1"/>
-    <w:lsdException w:name="heading 8" w:semiHidden="1" w:uiPriority="9" w:unhideWhenUsed="1" w:qFormat="1"/>
-    <w:lsdException w:name="heading 9" w:semiHidden="1" w:uiPriority="9" w:unhideWhenUsed="1" w:qFormat="1"/>
-    <w:lsdException w:name="index 1" w:semiHidden="1" w:unhideWhenUsed="1"/>
-    <w:lsdException w:name="index 2" w:semiHidden="1" w:unhideWhenUsed="1"/>
-    <w:lsdException w:name="index 3" w:semiHidden="1" w:unhideWhenUsed="1"/>
-    <w:lsdException w:name="index 4" w:semiHidden="1" w:unhideWhenUsed="1"/>
-    <w:lsdException w:name="index 5" w:semiHidden="1" w:unhideWhenUsed="1"/>
-    <w:lsdException w:name="index 6" w:semiHidden="1" w:unhideWhenUsed="1"/>
-    <w:lsdException w:name="index 7" w:semiHidden="1" w:unhideWhenUsed="1"/>
-    <w:lsdException w:name="index 8" w:semiHidden="1" w:unhideWhenUsed="1"/>
-    <w:lsdException w:name="index 9" w:semiHidden="1" w:unhideWhenUsed="1"/>
-    <w:lsdException w:name="toc 1" w:semiHidden="1" w:uiPriority="39" w:unhideWhenUsed="1"/>
-    <w:lsdException w:name="toc 2" w:semiHidden="1" w:uiPriority="39" w:unhideWhenUsed="1"/>
-    <w:lsdException w:name="toc 3" w:semiHidden="1" w:uiPriority="39" w:unhideWhenUsed="1"/>
-    <w:lsdException w:name="toc 4" w:semiHidden="1" w:uiPriority="39" w:unhideWhenUsed="1"/>
-    <w:lsdException w:name="toc 5" w:semiHidden="1" w:uiPriority="39" w:unhideWhenUsed="1"/>
-    <w:lsdException w:name="toc 6" w:semiHidden="1" w:uiPriority="39" w:unhideWhenUsed="1"/>
-    <w:lsdException w:name="toc 7" w:semiHidden="1" w:uiPriority="39" w:unhideWhenUsed="1"/>
-    <w:lsdException w:name="toc 8" w:semiHidden="1" w:uiPriority="39" w:unhideWhenUsed="1"/>
-    <w:lsdException w:name="toc 9" w:semiHidden="1" w:uiPriority="39" w:unhideWhenUsed="1"/>
-    <w:lsdException w:name="Normal Indent" w:semiHidden="1" w:unhideWhenUsed="1"/>
-    <w:lsdException w:name="footnote text" w:semiHidden="1" w:unhideWhenUsed="1"/>
-    <w:lsdException w:name="annotation text" w:semiHidden="1" w:unhideWhenUsed="1"/>
-    <w:lsdException w:name="header" w:semiHidden="1" w:unhideWhenUsed="1"/>
-    <w:lsdException w:name="footer" w:semiHidden="1" w:unhideWhenUsed="1"/>
-    <w:lsdException w:name="index heading" w:semiHidden="1" w:unhideWhenUsed="1"/>
-    <w:lsdException w:name="caption" w:semiHidden="1" w:uiPriority="35" w:unhideWhenUsed="1" w:qFormat="1"/>
-    <w:lsdException w:name="table of figures" w:semiHidden="1" w:unhideWhenUsed="1"/>
-    <w:lsdException w:name="envelope address" w:semiHidden="1" w:unhideWhenUsed="1"/>
-    <w:lsdException w:name="envelope return" w:semiHidden="1" w:unhideWhenUsed="1"/>
-    <w:lsdException w:name="footnote reference" w:semiHidden="1" w:unhideWhenUsed="1"/>
-    <w:lsdException w:name="annotation reference" w:semiHidden="1" w:unhideWhenUsed="1"/>
-    <w:lsdException w:name="line number" w:semiHidden="1" w:unhideWhenUsed="1"/>
-    <w:lsdException w:name="page number" w:semiHidden="1" w:unhideWhenUsed="1"/>
-    <w:lsdException w:name="endnote reference" w:semiHidden="1" w:unhideWhenUsed="1"/>
-    <w:lsdException w:name="endnote text" w:semiHidden="1" w:unhideWhenUsed="1"/>
-    <w:lsdException w:name="table of authorities" w:semiHidden="1" w:unhideWhenUsed="1"/>
-    <w:lsdException w:name="macro" w:semiHidden="1" w:unhideWhenUsed="1"/>
-    <w:lsdException w:name="toa heading" w:semiHidden="1" w:unhideWhenUsed="1"/>
-    <w:lsdException w:name="List" w:semiHidden="1" w:unhideWhenUsed="1"/>
-    <w:lsdException w:name="List Bullet" w:semiHidden="1" w:unhideWhenUsed="1"/>
-    <w:lsdException w:name="List Number" w:semiHidden="1" w:unhideWhenUsed="1"/>
-    <w:lsdException w:name="List 2" w:semiHidden="1" w:unhideWhenUsed="1"/>
-    <w:lsdException w:name="List 3" w:semiHidden="1" w:unhideWhenUsed="1"/>
-    <w:lsdException w:name="List 4" w:semiHidden="1" w:unhideWhenUsed="1"/>
-    <w:lsdException w:name="List 5" w:semiHidden="1" w:unhideWhenUsed="1"/>
-    <w:lsdException w:name="List Bullet 2" w:semiHidden="1" w:unhideWhenUsed="1"/>
-    <w:lsdException w:name="List Bullet 3" w:semiHidden="1" w:unhideWhenUsed="1"/>
-    <w:lsdException w:name="List Bullet 4" w:semiHidden="1" w:unhideWhenUsed="1"/>
-    <w:lsdException w:name="List Bullet 5" w:semiHidden="1" w:unhideWhenUsed="1"/>
-    <w:lsdException w:name="List Number 2" w:semiHidden="1" w:unhideWhenUsed="1"/>
-    <w:lsdException w:name="List Number 3" w:semiHidden="1" w:unhideWhenUsed="1"/>
-    <w:lsdException w:name="List Number 4" w:semiHidden="1" w:unhideWhenUsed="1"/>
-    <w:lsdException w:name="List Number 5" w:semiHidden="1" w:unhideWhenUsed="1"/>
-    <w:lsdException w:name="Title" w:uiPriority="10" w:qFormat="1"/>
-    <w:lsdException w:name="Closing" w:semiHidden="1" w:unhideWhenUsed="1"/>
-    <w:lsdException w:name="Signature" w:semiHidden="1" w:unhideWhenUsed="1"/>
-    <w:lsdException w:name="Default Paragraph Font" w:semiHidden="1" w:uiPriority="1" w:unhideWhenUsed="1"/>
-    <w:lsdException w:name="Body Text" w:semiHidden="1" w:unhideWhenUsed="1"/>
-    <w:lsdException w:name="Body Text Indent" w:semiHidden="1" w:unhideWhenUsed="1"/>
-    <w:lsdException w:name="List Continue" w:semiHidden="1" w:unhideWhenUsed="1"/>
-    <w:lsdException w:name="List Continue 2" w:semiHidden="1" w:unhideWhenUsed="1"/>
-    <w:lsdException w:name="List Continue 3" w:semiHidden="1" w:unhideWhenUsed="1"/>
-    <w:lsdException w:name="List Continue 4" w:semiHidden="1" w:unhideWhenUsed="1"/>
-    <w:lsdException w:name="List Continue 5" w:semiHidden="1" w:unhideWhenUsed="1"/>
-    <w:lsdException w:name="Message Header" w:semiHidden="1" w:unhideWhenUsed="1"/>
-    <w:lsdException w:name="Subtitle" w:uiPriority="11" w:qFormat="1"/>
-    <w:lsdException w:name="Salutation" w:semiHidden="1" w:unhideWhenUsed="1"/>
-    <w:lsdException w:name="Date" w:semiHidden="1" w:unhideWhenUsed="1"/>
-    <w:lsdException w:name="Body Text First Indent" w:semiHidden="1" w:unhideWhenUsed="1"/>
-    <w:lsdException w:name="Body Text First Indent 2" w:semiHidden="1" w:unhideWhenUsed="1"/>
-    <w:lsdException w:name="Note Heading" w:semiHidden="1" w:unhideWhenUsed="1"/>
-    <w:lsdException w:name="Body Text 2" w:semiHidden="1" w:unhideWhenUsed="1"/>
-    <w:lsdException w:name="Body Text 3" w:semiHidden="1" w:unhideWhenUsed="1"/>
-    <w:lsdException w:name="Body Text Indent 2" w:semiHidden="1" w:unhideWhenUsed="1"/>
-    <w:lsdException w:name="Body Text Indent 3" w:semiHidden="1" w:unhideWhenUsed="1"/>
-    <w:lsdException w:name="Block Text" w:semiHidden="1" w:unhideWhenUsed="1"/>
-    <w:lsdException w:name="Hyperlink" w:semiHidden="1" w:unhideWhenUsed="1"/>
-    <w:lsdException w:name="FollowedHyperlink" w:semiHidden="1" w:unhideWhenUsed="1"/>
-    <w:lsdException w:name="Strong" w:uiPriority="22" w:qFormat="1"/>
-    <w:lsdException w:name="Emphasis" w:uiPriority="20" w:qFormat="1"/>
-    <w:lsdException w:name="Document Map" w:semiHidden="1" w:unhideWhenUsed="1"/>
-    <w:lsdException w:name="Plain Text" w:semiHidden="1" w:unhideWhenUsed="1"/>
-    <w:lsdException w:name="E-mail Signature" w:semiHidden="1" w:unhideWhenUsed="1"/>
-    <w:lsdException w:name="HTML Top of Form" w:semiHidden="1" w:unhideWhenUsed="1"/>
-    <w:lsdException w:name="HTML Bottom of Form" w:semiHidden="1" w:unhideWhenUsed="1"/>
-    <w:lsdException w:name="Normal (Web)" w:semiHidden="1" w:unhideWhenUsed="1"/>
-    <w:lsdException w:name="HTML Acronym" w:semiHidden="1" w:unhideWhenUsed="1"/>
-    <w:lsdException w:name="HTML Address" w:semiHidden="1" w:unhideWhenUsed="1"/>
-    <w:lsdException w:name="HTML Cite" w:semiHidden="1" w:unhideWhenUsed="1"/>
-    <w:lsdException w:name="HTML Code" w:semiHidden="1" w:unhideWhenUsed="1"/>
-    <w:lsdException w:name="HTML Definition" w:semiHidden="1" w:unhideWhenUsed="1"/>
-    <w:lsdException w:name="HTML Keyboard" w:semiHidden="1" w:unhideWhenUsed="1"/>
-    <w:lsdException w:name="HTML Preformatted" w:semiHidden="1" w:unhideWhenUsed="1"/>
-    <w:lsdException w:name="HTML Sample" w:semiHidden="1" w:unhideWhenUsed="1"/>
-    <w:lsdException w:name="HTML Typewriter" w:semiHidden="1" w:unhideWhenUsed="1"/>
-    <w:lsdException w:name="HTML Variable" w:semiHidden="1" w:unhideWhenUsed="1"/>
-    <w:lsdException w:name="Normal Table" w:semiHidden="1" w:unhideWhenUsed="1"/>
-    <w:lsdException w:name="annotation subject" w:semiHidden="1" w:unhideWhenUsed="1"/>
-    <w:lsdException w:name="No List" w:semiHidden="1" w:unhideWhenUsed="1"/>
-    <w:lsdException w:name="Outline List 1" w:semiHidden="1" w:unhideWhenUsed="1"/>
-    <w:lsdException w:name="Outline List 2" w:semiHidden="1" w:unhideWhenUsed="1"/>
-    <w:lsdException w:name="Outline List 3" w:semiHidden="1" w:unhideWhenUsed="1"/>
-    <w:lsdException w:name="Table Simple 1" w:semiHidden="1" w:unhideWhenUsed="1"/>
-    <w:lsdException w:name="Table Simple 2" w:semiHidden="1" w:unhideWhenUsed="1"/>
-    <w:lsdException w:name="Table Simple 3" w:semiHidden="1" w:unhideWhenUsed="1"/>
-    <w:lsdException w:name="Table Classic 1" w:semiHidden="1" w:unhideWhenUsed="1"/>
-    <w:lsdException w:name="Table Classic 2" w:semiHidden="1" w:unhideWhenUsed="1"/>
-    <w:lsdException w:name="Table Classic 3" w:semiHidden="1" w:unhideWhenUsed="1"/>
-    <w:lsdException w:name="Table Classic 4" w:semiHidden="1" w:unhideWhenUsed="1"/>
-    <w:lsdException w:name="Table Colorful 1" w:semiHidden="1" w:unhideWhenUsed="1"/>
-    <w:lsdException w:name="Table Colorful 2" w:semiHidden="1" w:unhideWhenUsed="1"/>
-    <w:lsdException w:name="Table Colorful 3" w:semiHidden="1" w:unhideWhenUsed="1"/>
-    <w:lsdException w:name="Table Columns 1" w:semiHidden="1" w:unhideWhenUsed="1"/>
-    <w:lsdException w:name="Table Columns 2" w:semiHidden="1" w:unhideWhenUsed="1"/>
-    <w:lsdException w:name="Table Columns 3" w:semiHidden="1" w:unhideWhenUsed="1"/>
-    <w:lsdException w:name="Table Columns 4" w:semiHidden="1" w:unhideWhenUsed="1"/>
-    <w:lsdException w:name="Table Columns 5" w:semiHidden="1" w:unhideWhenUsed="1"/>
-    <w:lsdException w:name="Table Grid 1" w:semiHidden="1" w:unhideWhenUsed="1"/>
-    <w:lsdException w:name="Table Grid 2" w:semiHidden="1" w:unhideWhenUsed="1"/>
-    <w:lsdException w:name="Table Grid 3" w:semiHidden="1" w:unhideWhenUsed="1"/>
-    <w:lsdException w:name="Table Grid 4" w:semiHidden="1" w:unhideWhenUsed="1"/>
-    <w:lsdException w:name="Table Grid 5" w:semiHidden="1" w:unhideWhenUsed="1"/>
-    <w:lsdException w:name="Table Grid 6" w:semiHidden="1" w:unhideWhenUsed="1"/>
-    <w:lsdException w:name="Table Grid 7" w:semiHidden="1" w:unhideWhenUsed="1"/>
-    <w:lsdException w:name="Table Grid 8" w:semiHidden="1" w:unhideWhenUsed="1"/>
-    <w:lsdException w:name="Table List 1" w:semiHidden="1" w:unhideWhenUsed="1"/>
-    <w:lsdException w:name="Table List 2" w:semiHidden="1" w:unhideWhenUsed="1"/>
-    <w:lsdException w:name="Table List 3" w:semiHidden="1" w:unhideWhenUsed="1"/>
-    <w:lsdException w:name="Table List 4" w:semiHidden="1" w:unhideWhenUsed="1"/>
-    <w:lsdException w:name="Table List 5" w:semiHidden="1" w:unhideWhenUsed="1"/>
-    <w:lsdException w:name="Table List 6" w:semiHidden="1" w:unhideWhenUsed="1"/>
-    <w:lsdException w:name="Table List 7" w:semiHidden="1" w:unhideWhenUsed="1"/>
-    <w:lsdException w:name="Table List 8" w:semiHidden="1" w:unhideWhenUsed="1"/>
-    <w:lsdException w:name="Table 3D effects 1" w:semiHidden="1" w:unhideWhenUsed="1"/>
-    <w:lsdException w:name="Table 3D effects 2" w:semiHidden="1" w:unhideWhenUsed="1"/>
-    <w:lsdException w:name="Table 3D effects 3" w:semiHidden="1" w:unhideWhenUsed="1"/>
-    <w:lsdException w:name="Table Contemporary" w:semiHidden="1" w:unhideWhenUsed="1"/>
-    <w:lsdException w:name="Table Elegant" w:semiHidden="1" w:unhideWhenUsed="1"/>
-    <w:lsdException w:name="Table Professional" w:semiHidden="1" w:unhideWhenUsed="1"/>
-    <w:lsdException w:name="Table Subtle 1" w:semiHidden="1" w:unhideWhenUsed="1"/>
-    <w:lsdException w:name="Table Subtle 2" w:semiHidden="1" w:unhideWhenUsed="1"/>
-    <w:lsdException w:name="Table Web 1" w:semiHidden="1" w:unhideWhenUsed="1"/>
-    <w:lsdException w:name="Table Web 2" w:semiHidden="1" w:unhideWhenUsed="1"/>
-    <w:lsdException w:name="Table Web 3" w:semiHidden="1" w:unhideWhenUsed="1"/>
-    <w:lsdException w:name="Balloon Text" w:semiHidden="1" w:unhideWhenUsed="1"/>
-    <w:lsdException w:name="Table Grid" w:uiPriority="39"/>
-    <w:lsdException w:name="Table Theme" w:semiHidden="1" w:unhideWhenUsed="1"/>
-    <w:lsdException w:name="Placeholder Text" w:semiHidden="1"/>
-    <w:lsdException w:name="No Spacing" w:uiPriority="1" w:qFormat="1"/>
-    <w:lsdException w:name="Light Shading" w:uiPriority="60"/>
-    <w:lsdException w:name="Light List" w:uiPriority="61"/>
-    <w:lsdException w:name="Light Grid" w:uiPriority="62"/>
-    <w:lsdException w:name="Medium Shading 1" w:uiPriority="63"/>
-    <w:lsdException w:name="Medium Shading 2" w:uiPriority="64"/>
-    <w:lsdException w:name="Medium List 1" w:uiPriority="65"/>
-    <w:lsdException w:name="Medium List 2" w:uiPriority="66"/>
-    <w:lsdException w:name="Medium Grid 1" w:uiPriority="67"/>
-    <w:lsdException w:name="Medium Grid 2" w:uiPriority="68"/>
-    <w:lsdException w:name="Medium Grid 3" w:uiPriority="69"/>
-    <w:lsdException w:name="Dark List" w:uiPriority="70"/>
-    <w:lsdException w:name="Colorful Shading" w:uiPriority="71"/>
-    <w:lsdException w:name="Colorful List" w:uiPriority="72"/>
-    <w:lsdException w:name="Colorful Grid" w:uiPriority="73"/>
-    <w:lsdException w:name="Light Shading Accent 1" w:uiPriority="60"/>
-    <w:lsdException w:name="Light List Accent 1" w:uiPriority="61"/>
-    <w:lsdException w:name="Light Grid Accent 1" w:uiPriority="62"/>
-    <w:lsdException w:name="Medium Shading 1 Accent 1" w:uiPriority="63"/>
-    <w:lsdException w:name="Medium Shading 2 Accent 1" w:uiPriority="64"/>
-    <w:lsdException w:name="Medium List 1 Accent 1" w:uiPriority="65"/>
-    <w:lsdException w:name="Revision" w:semiHidden="1"/>
-    <w:lsdException w:name="List Paragraph" w:uiPriority="34" w:qFormat="1"/>
-    <w:lsdException w:name="Quote" w:uiPriority="29" w:qFormat="1"/>
-    <w:lsdException w:name="Intense Quote" w:uiPriority="30" w:qFormat="1"/>
-    <w:lsdException w:name="Medium List 2 Accent 1" w:uiPriority="66"/>
-    <w:lsdException w:name="Medium Grid 1 Accent 1" w:uiPriority="67"/>
-    <w:lsdException w:name="Medium Grid 2 Accent 1" w:uiPriority="68"/>
-    <w:lsdException w:name="Medium Grid 3 Accent 1" w:uiPriority="69"/>
-    <w:lsdException w:name="Dark List Accent 1" w:uiPriority="70"/>
-    <w:lsdException w:name="Colorful Shading Accent 1" w:uiPriority="71"/>
-    <w:lsdException w:name="Colorful List Accent 1" w:uiPriority="72"/>
-    <w:lsdException w:name="Colorful Grid Accent 1" w:uiPriority="73"/>
-    <w:lsdException w:name="Light Shading Accent 2" w:uiPriority="60"/>
-    <w:lsdException w:name="Light List Accent 2" w:uiPriority="61"/>
-    <w:lsdException w:name="Light Grid Accent 2" w:uiPriority="62"/>
-    <w:lsdException w:name="Medium Shading 1 Accent 2" w:uiPriority="63"/>
-    <w:lsdException w:name="Medium Shading 2 Accent 2" w:uiPriority="64"/>
-    <w:lsdException w:name="Medium List 1 Accent 2" w:uiPriority="65"/>
-    <w:lsdException w:name="Medium List 2 Accent 2" w:uiPriority="66"/>
-    <w:lsdException w:name="Medium Grid 1 Accent 2" w:uiPriority="67"/>
-    <w:lsdException w:name="Medium Grid 2 Accent 2" w:uiPriority="68"/>
-    <w:lsdException w:name="Medium Grid 3 Accent 2" w:uiPriority="69"/>
-    <w:lsdException w:name="Dark List Accent 2" w:uiPriority="70"/>
-    <w:lsdException w:name="Colorful Shading Accent 2" w:uiPriority="71"/>
-    <w:lsdException w:name="Colorful List Accent 2" w:uiPriority="72"/>
-    <w:lsdException w:name="Colorful Grid Accent 2" w:uiPriority="73"/>
-    <w:lsdException w:name="Light Shading Accent 3" w:uiPriority="60"/>
-    <w:lsdException w:name="Light List Accent 3" w:uiPriority="61"/>
-    <w:lsdException w:name="Light Grid Accent 3" w:uiPriority="62"/>
-    <w:lsdException w:name="Medium Shading 1 Accent 3" w:uiPriority="63"/>
-    <w:lsdException w:name="Medium Shading 2 Accent 3" w:uiPriority="64"/>
-    <w:lsdException w:name="Medium List 1 Accent 3" w:uiPriority="65"/>
-    <w:lsdException w:name="Medium List 2 Accent 3" w:uiPriority="66"/>
-    <w:lsdException w:name="Medium Grid 1 Accent 3" w:uiPriority="67"/>
-    <w:lsdException w:name="Medium Grid 2 Accent 3" w:uiPriority="68"/>
-    <w:lsdException w:name="Medium Grid 3 Accent 3" w:uiPriority="69"/>
-    <w:lsdException w:name="Dark List Accent 3" w:uiPriority="70"/>
-    <w:lsdException w:name="Colorful Shading Accent 3" w:uiPriority="71"/>
-    <w:lsdException w:name="Colorful List Accent 3" w:uiPriority="72"/>
-    <w:lsdException w:name="Colorful Grid Accent 3" w:uiPriority="73"/>
-    <w:lsdException w:name="Light Shading Accent 4" w:uiPriority="60"/>
-    <w:lsdException w:name="Light List Accent 4" w:uiPriority="61"/>
-    <w:lsdException w:name="Light Grid Accent 4" w:uiPriority="62"/>
-    <w:lsdException w:name="Medium Shading 1 Accent 4" w:uiPriority="63"/>
-    <w:lsdException w:name="Medium Shading 2 Accent 4" w:uiPriority="64"/>
-    <w:lsdException w:name="Medium List 1 Accent 4" w:uiPriority="65"/>
-    <w:lsdException w:name="Medium List 2 Accent 4" w:uiPriority="66"/>
-    <w:lsdException w:name="Medium Grid 1 Accent 4" w:uiPriority="67"/>
-    <w:lsdException w:name="Medium Grid 2 Accent 4" w:uiPriority="68"/>
-    <w:lsdException w:name="Medium Grid 3 Accent 4" w:uiPriority="69"/>
-    <w:lsdException w:name="Dark List Accent 4" w:uiPriority="70"/>
-    <w:lsdException w:name="Colorful Shading Accent 4" w:uiPriority="71"/>
-    <w:lsdException w:name="Colorful List Accent 4" w:uiPriority="72"/>
-    <w:lsdException w:name="Colorful Grid Accent 4" w:uiPriority="73"/>
-    <w:lsdException w:name="Light Shading Accent 5" w:uiPriority="60"/>
-    <w:lsdException w:name="Light List Accent 5" w:uiPriority="61"/>
-    <w:lsdException w:name="Light Grid Accent 5" w:uiPriority="62"/>
-    <w:lsdException w:name="Medium Shading 1 Accent 5" w:uiPriority="63"/>
-    <w:lsdException w:name="Medium Shading 2 Accent 5" w:uiPriority="64"/>
-    <w:lsdException w:name="Medium List 1 Accent 5" w:uiPriority="65"/>
-    <w:lsdException w:name="Medium List 2 Accent 5" w:uiPriority="66"/>
-    <w:lsdException w:name="Medium Grid 1 Accent 5" w:uiPriority="67"/>
-    <w:lsdException w:name="Medium Grid 2 Accent 5" w:uiPriority="68"/>
-    <w:lsdException w:name="Medium Grid 3 Accent 5" w:uiPriority="69"/>
-    <w:lsdException w:name="Dark List Accent 5" w:uiPriority="70"/>
-    <w:lsdException w:name="Colorful Shading Accent 5" w:uiPriority="71"/>
-    <w:lsdException w:name="Colorful List Accent 5" w:uiPriority="72"/>
-    <w:lsdException w:name="Colorful Grid Accent 5" w:uiPriority="73"/>
-    <w:lsdException w:name="Light Shading Accent 6" w:uiPriority="60"/>
-    <w:lsdException w:name="Light List Accent 6" w:uiPriority="61"/>
-    <w:lsdException w:name="Light Grid Accent 6" w:uiPriority="62"/>
-    <w:lsdException w:name="Medium Shading 1 Accent 6" w:uiPriority="63"/>
-    <w:lsdException w:name="Medium Shading 2 Accent 6" w:uiPriority="64"/>
-    <w:lsdException w:name="Medium List 1 Accent 6" w:uiPriority="65"/>
-    <w:lsdException w:name="Medium List 2 Accent 6" w:uiPriority="66"/>
-    <w:lsdException w:name="Medium Grid 1 Accent 6" w:uiPriority="67"/>
-    <w:lsdException w:name="Medium Grid 2 Accent 6" w:uiPriority="68"/>
-    <w:lsdException w:name="Medium Grid 3 Accent 6" w:uiPriority="69"/>
-    <w:lsdException w:name="Dark List Accent 6" w:uiPriority="70"/>
-    <w:lsdException w:name="Colorful Shading Accent 6" w:uiPriority="71"/>
-    <w:lsdException w:name="Colorful List Accent 6" w:uiPriority="72"/>
-    <w:lsdException w:name="Colorful Grid Accent 6" w:uiPriority="73"/>
-    <w:lsdException w:name="Subtle Emphasis" w:uiPriority="19" w:qFormat="1"/>
-    <w:lsdException w:name="Intense Emphasis" w:uiPriority="21" w:qFormat="1"/>
-    <w:lsdException w:name="Subtle Reference" w:uiPriority="31" w:qFormat="1"/>
-    <w:lsdException w:name="Intense Reference" w:uiPriority="32" w:qFormat="1"/>
-    <w:lsdException w:name="Book Title" w:uiPriority="33" w:qFormat="1"/>
-    <w:lsdException w:name="Bibliography" w:semiHidden="1" w:uiPriority="37" w:unhideWhenUsed="1"/>
-    <w:lsdException w:name="TOC Heading" w:semiHidden="1" w:uiPriority="39" w:unhideWhenUsed="1" w:qFormat="1"/>
-    <w:lsdException w:name="Plain Table 1" w:uiPriority="41"/>
-    <w:lsdException w:name="Plain Table 2" w:uiPriority="42"/>
-    <w:lsdException w:name="Plain Table 3" w:uiPriority="43"/>
-    <w:lsdException w:name="Plain Table 4" w:uiPriority="44"/>
-    <w:lsdException w:name="Plain Table 5" w:uiPriority="45"/>
-    <w:lsdException w:name="Grid Table Light" w:uiPriority="40"/>
-    <w:lsdException w:name="Grid Table 1 Light" w:uiPriority="46"/>
-    <w:lsdException w:name="Grid Table 2" w:uiPriority="47"/>
-    <w:lsdException w:name="Grid Table 3" w:uiPriority="48"/>
-    <w:lsdException w:name="Grid Table 4" w:uiPriority="49"/>
-    <w:lsdException w:name="Grid Table 5 Dark" w:uiPriority="50"/>
-    <w:lsdException w:name="Grid Table 6 Colorful" w:uiPriority="51"/>
-    <w:lsdException w:name="Grid Table 7 Colorful" w:uiPriority="52"/>
-    <w:lsdException w:name="Grid Table 1 Light Accent 1" w:uiPriority="46"/>
-    <w:lsdException w:name="Grid Table 2 Accent 1" w:uiPriority="47"/>
-    <w:lsdException w:name="Grid Table 3 Accent 1" w:uiPriority="48"/>
-    <w:lsdException w:name="Grid Table 4 Accent 1" w:uiPriority="49"/>
-    <w:lsdException w:name="Grid Table 5 Dark Accent 1" w:uiPriority="50"/>
-    <w:lsdException w:name="Grid Table 6 Colorful Accent 1" w:uiPriority="51"/>
-    <w:lsdException w:name="Grid Table 7 Colorful Accent 1" w:uiPriority="52"/>
-    <w:lsdException w:name="Grid Table 1 Light Accent 2" w:uiPriority="46"/>
-    <w:lsdException w:name="Grid Table 2 Accent 2" w:uiPriority="47"/>
-    <w:lsdException w:name="Grid Table 3 Accent 2" w:uiPriority="48"/>
-    <w:lsdException w:name="Grid Table 4 Accent 2" w:uiPriority="49"/>
-    <w:lsdException w:name="Grid Table 5 Dark Accent 2" w:uiPriority="50"/>
-    <w:lsdException w:name="Grid Table 6 Colorful Accent 2" w:uiPriority="51"/>
-    <w:lsdException w:name="Grid Table 7 Colorful Accent 2" w:uiPriority="52"/>
-    <w:lsdException w:name="Grid Table 1 Light Accent 3" w:uiPriority="46"/>
-    <w:lsdException w:name="Grid Table 2 Accent 3" w:uiPriority="47"/>
-    <w:lsdException w:name="Grid Table 3 Accent 3" w:uiPriority="48"/>
-    <w:lsdException w:name="Grid Table 4 Accent 3" w:uiPriority="49"/>
-    <w:lsdException w:name="Grid Table 5 Dark Accent 3" w:uiPriority="50"/>
-    <w:lsdException w:name="Grid Table 6 Colorful Accent 3" w:uiPriority="51"/>
-    <w:lsdException w:name="Grid Table 7 Colorful Accent 3" w:uiPriority="52"/>
-    <w:lsdException w:name="Grid Table 1 Light Accent 4" w:uiPriority="46"/>
-    <w:lsdException w:name="Grid Table 2 Accent 4" w:uiPriority="47"/>
-    <w:lsdException w:name="Grid Table 3 Accent 4" w:uiPriority="48"/>
-    <w:lsdException w:name="Grid Table 4 Accent 4" w:uiPriority="49"/>
-    <w:lsdException w:name="Grid Table 5 Dark Accent 4" w:uiPriority="50"/>
-    <w:lsdException w:name="Grid Table 6 Colorful Accent 4" w:uiPriority="51"/>
-    <w:lsdException w:name="Grid Table 7 Colorful Accent 4" w:uiPriority="52"/>
-    <w:lsdException w:name="Grid Table 1 Light Accent 5" w:uiPriority="46"/>
-    <w:lsdException w:name="Grid Table 2 Accent 5" w:uiPriority="47"/>
-    <w:lsdException w:name="Grid Table 3 Accent 5" w:uiPriority="48"/>
-    <w:lsdException w:name="Grid Table 4 Accent 5" w:uiPriority="49"/>
-    <w:lsdException w:name="Grid Table 5 Dark Accent 5" w:uiPriority="50"/>
-    <w:lsdException w:name="Grid Table 6 Colorful Accent 5" w:uiPriority="51"/>
-    <w:lsdException w:name="Grid Table 7 Colorful Accent 5" w:uiPriority="52"/>
-    <w:lsdException w:name="Grid Table 1 Light Accent 6" w:uiPriority="46"/>
-    <w:lsdException w:name="Grid Table 2 Accent 6" w:uiPriority="47"/>
-    <w:lsdException w:name="Grid Table 3 Accent 6" w:uiPriority="48"/>
-    <w:lsdException w:name="Grid Table 4 Accent 6" w:uiPriority="49"/>
-    <w:lsdException w:name="Grid Table 5 Dark Accent 6" w:uiPriority="50"/>
-    <w:lsdException w:name="Grid Table 6 Colorful Accent 6" w:uiPriority="51"/>
-    <w:lsdException w:name="Grid Table 7 Colorful Accent 6" w:uiPriority="52"/>
-    <w:lsdException w:name="List Table 1 Light" w:uiPriority="46"/>
-    <w:lsdException w:name="List Table 2" w:uiPriority="47"/>
-    <w:lsdException w:name="List Table 3" w:uiPriority="48"/>
-    <w:lsdException w:name="List Table 4" w:uiPriority="49"/>
-    <w:lsdException w:name="List Table 5 Dark" w:uiPriority="50"/>
-    <w:lsdException w:name="List Table 6 Colorful" w:uiPriority="51"/>
-    <w:lsdException w:name="List Table 7 Colorful" w:uiPriority="52"/>
-    <w:lsdException w:name="List Table 1 Light Accent 1" w:uiPriority="46"/>
-    <w:lsdException w:name="List Table 2 Accent 1" w:uiPriority="47"/>
-    <w:lsdException w:name="List Table 3 Accent 1" w:uiPriority="48"/>
-    <w:lsdException w:name="List Table 4 Accent 1" w:uiPriority="49"/>
-    <w:lsdException w:name="List Table 5 Dark Accent 1" w:uiPriority="50"/>
-    <w:lsdException w:name="List Table 6 Colorful Accent 1" w:uiPriority="51"/>
-    <w:lsdException w:name="List Table 7 Colorful Accent 1" w:uiPriority="52"/>
-    <w:lsdException w:name="List Table 1 Light Accent 2" w:uiPriority="46"/>
-    <w:lsdException w:name="List Table 2 Accent 2" w:uiPriority="47"/>
-    <w:lsdException w:name="List Table 3 Accent 2" w:uiPriority="48"/>
-    <w:lsdException w:name="List Table 4 Accent 2" w:uiPriority="49"/>
-    <w:lsdException w:name="List Table 5 Dark Accent 2" w:uiPriority="50"/>
-    <w:lsdException w:name="List Table 6 Colorful Accent 2" w:uiPriority="51"/>
-    <w:lsdException w:name="List Table 7 Colorful Accent 2" w:uiPriority="52"/>
-    <w:lsdException w:name="List Table 1 Light Accent 3" w:uiPriority="46"/>
-    <w:lsdException w:name="List Table 2 Accent 3" w:uiPriority="47"/>
-    <w:lsdException w:name="List Table 3 Accent 3" w:uiPriority="48"/>
-    <w:lsdException w:name="List Table 4 Accent 3" w:uiPriority="49"/>
-    <w:lsdException w:name="List Table 5 Dark Accent 3" w:uiPriority="50"/>
-    <w:lsdException w:name="List Table 6 Colorful Accent 3" w:uiPriority="51"/>
-    <w:lsdException w:name="List Table 7 Colorful Accent 3" w:uiPriority="52"/>
-    <w:lsdException w:name="List Table 1 Light Accent 4" w:uiPriority="46"/>
-    <w:lsdException w:name="List Table 2 Accent 4" w:uiPriority="47"/>
-    <w:lsdException w:name="List Table 3 Accent 4" w:uiPriority="48"/>
-    <w:lsdException w:name="List Table 4 Accent 4" w:uiPriority="49"/>
-    <w:lsdException w:name="List Table 5 Dark Accent 4" w:uiPriority="50"/>
-    <w:lsdException w:name="List Table 6 Colorful Accent 4" w:uiPriority="51"/>
-    <w:lsdException w:name="List Table 7 Colorful Accent 4" w:uiPriority="52"/>
-    <w:lsdException w:name="List Table 1 Light Accent 5" w:uiPriority="46"/>
-    <w:lsdException w:name="List Table 2 Accent 5" w:uiPriority="47"/>
-    <w:lsdException w:name="List Table 3 Accent 5" w:uiPriority="48"/>
-    <w:lsdException w:name="List Table 4 Accent 5" w:uiPriority="49"/>
-    <w:lsdException w:name="List Table 5 Dark Accent 5" w:uiPriority="50"/>
-    <w:lsdException w:name="List Table 6 Colorful Accent 5" w:uiPriority="51"/>
-    <w:lsdException w:name="List Table 7 Colorful Accent 5" w:uiPriority="52"/>
-    <w:lsdException w:name="List Table 1 Light Accent 6" w:uiPriority="46"/>
-    <w:lsdException w:name="List Table 2 Accent 6" w:uiPriority="47"/>
-    <w:lsdException w:name="List Table 3 Accent 6" w:uiPriority="48"/>
-    <w:lsdException w:name="List Table 4 Accent 6" w:uiPriority="49"/>
-    <w:lsdException w:name="List Table 5 Dark Accent 6" w:uiPriority="50"/>
-    <w:lsdException w:name="List Table 6 Colorful Accent 6" w:uiPriority="51"/>
-    <w:lsdException w:name="List Table 7 Colorful Accent 6" w:uiPriority="52"/>
-    <w:lsdException w:name="Mention" w:semiHidden="1" w:unhideWhenUsed="1"/>
-    <w:lsdException w:name="Smart Hyperlink" w:semiHidden="1" w:unhideWhenUsed="1"/>
-    <w:lsdException w:name="Hashtag" w:semiHidden="1" w:unhideWhenUsed="1"/>
-    <w:lsdException w:name="Unresolved Mention" w:semiHidden="1" w:unhideWhenUsed="1"/>
-    <w:lsdException w:name="Smart Link" w:semiHidden="1" w:unhideWhenUsed="1"/>
-  </w:latentStyles>
-  <w:style w:type="paragraph" w:default="1" w:styleId="Normal">
-    <w:name w:val="Normal"/>
-    <w:qFormat/>
-  </w:style>
-  <w:style w:type="character" w:default="1" w:styleId="DefaultParagraphFont">
-    <w:name w:val="Default Paragraph Font"/>
-    <w:uiPriority w:val="1"/>
-    <w:semiHidden/>
-    <w:unhideWhenUsed/>
-  </w:style>
-  <w:style w:type="table" w:default="1" w:styleId="TableNormal">
-    <w:name w:val="Normal Table"/>
-    <w:uiPriority w:val="99"/>
-    <w:semiHidden/>
-    <w:unhideWhenUsed/>
-    <w:tblPr>
-      <w:tblInd w:w="0" w:type="dxa"/>
-      <w:tblCellMar>
-        <w:top w:w="0" w:type="dxa"/>
-        <w:left w:w="108" w:type="dxa"/>
-        <w:bottom w:w="0" w:type="dxa"/>
-        <w:right w:w="108" w:type="dxa"/>
-      </w:tblCellMar>
-    </w:tblPr>
-    <w:trPr>
-      <w:hidden/>
-    </w:trPr>
-  </w:style>
-  <w:style w:type="numbering" w:default="1" w:styleId="NoList">
-    <w:name w:val="No List"/>
-    <w:uiPriority w:val="99"/>
-    <w:semiHidden/>
-    <w:unhideWhenUsed/>
-  </w:style>
-  <w:style w:type="character" w:styleId="PlaceholderText">
-    <w:name w:val="Placeholder Text"/>
-    <w:basedOn w:val="DefaultParagraphFont"/>
-    <w:uiPriority w:val="99"/>
-    <w:semiHidden/>
-    <w:rsid w:val="00291BB2"/>
-    <w:rPr>
-      <w:color w:val="808080"/>
-    </w:rPr>
-  </w:style>
-  <w:style w:type="paragraph" w:customStyle="1" w:styleId="1C8175ADAE644306BD623AA062986D0A">
-    <w:name w:val="1C8175ADAE644306BD623AA062986D0A"/>
-  </w:style>
-  <w:style w:type="paragraph" w:customStyle="1" w:styleId="6E04C38900AD4D7EA1D77BC74B787406">
-    <w:name w:val="6E04C38900AD4D7EA1D77BC74B787406"/>
-  </w:style>
-  <w:style w:type="paragraph" w:customStyle="1" w:styleId="3510DCF10A6A4C7C9B4E0A2E7D9A5C98">
-    <w:name w:val="3510DCF10A6A4C7C9B4E0A2E7D9A5C98"/>
-  </w:style>
-  <w:style w:type="paragraph" w:customStyle="1" w:styleId="AC0A03EB40B248728588566F5B037191">
-    <w:name w:val="AC0A03EB40B248728588566F5B037191"/>
-  </w:style>
-  <w:style w:type="paragraph" w:customStyle="1" w:styleId="C4070BBB73EF4223B2448ADDBECA9259">
-    <w:name w:val="C4070BBB73EF4223B2448ADDBECA9259"/>
-  </w:style>
-  <w:style w:type="paragraph" w:customStyle="1" w:styleId="1F5D03E2B0F240F6ADDED37C8DBB040A">
-    <w:name w:val="1F5D03E2B0F240F6ADDED37C8DBB040A"/>
-  </w:style>
-  <w:style w:type="paragraph" w:customStyle="1" w:styleId="A4B9D7B7267044F5BC7C7C46200DBA14">
-    <w:name w:val="A4B9D7B7267044F5BC7C7C46200DBA14"/>
-  </w:style>
-</w:styles>
-</file>
-
-<file path=word/glossary/webSettings.xml><?xml version="1.0" encoding="utf-8"?>
-<w:webSettings xmlns:mc="http://schemas.openxmlformats.org/markup-compatibility/2006" xmlns:r="http://schemas.openxmlformats.org/officeDocument/2006/relationships" xmlns:w="http://schemas.openxmlformats.org/wordprocessingml/2006/main" xmlns:w14="http://schemas.microsoft.com/office/word/2010/wordml" xmlns:w15="http://schemas.microsoft.com/office/word/2012/wordml" xmlns:w16cex="http://schemas.microsoft.com/office/word/2018/wordml/cex" xmlns:w16cid="http://schemas.microsoft.com/office/word/2016/wordml/cid" xmlns:w16="http://schemas.microsoft.com/office/word/2018/wordml" xmlns:w16du="http://schemas.microsoft.com/office/word/2023/wordml/word16du" xmlns:w16sdtdh="http://schemas.microsoft.com/office/word/2020/wordml/sdtdatahash" xmlns:w16sdtfl="http://schemas.microsoft.com/office/word/2024/wordml/sdtformatlock" xmlns:w16se="http://schemas.microsoft.com/office/word/2015/wordml/symex" mc:Ignorable="w14 w15 w16se w16cid w16 w16cex w16sdtdh w16sdtfl w16du">
-  <w:optimizeForBrowser/>
-  <w:allowPNG/>
-</w:webSettings>
 </file>
 
 <file path=word/theme/theme1.xml><?xml version="1.0" encoding="utf-8"?>
@@ -19356,6 +18022,25 @@
 </file>
 
 <file path=customXml/item1.xml><?xml version="1.0" encoding="utf-8"?>
+<p:properties xmlns:p="http://schemas.microsoft.com/office/2006/metadata/properties" xmlns:xsi="http://www.w3.org/2001/XMLSchema-instance" xmlns:pc="http://schemas.microsoft.com/office/infopath/2007/PartnerControls">
+  <documentManagement/>
+</p:properties>
+</file>
+
+<file path=customXml/item2.xml><?xml version="1.0" encoding="utf-8"?>
+<b:Sources xmlns:b="http://schemas.openxmlformats.org/officeDocument/2006/bibliography" xmlns="http://schemas.openxmlformats.org/officeDocument/2006/bibliography" SelectedStyle="\APA.XSL" StyleName="APA"/>
+</file>
+
+<file path=customXml/item3.xml><?xml version="1.0" encoding="utf-8"?>
+<?mso-contentType ?>
+<FormTemplates xmlns="http://schemas.microsoft.com/sharepoint/v3/contenttype/forms">
+  <Display>DocumentLibraryForm</Display>
+  <Edit>DocumentLibraryForm</Edit>
+  <New>DocumentLibraryForm</New>
+</FormTemplates>
+</file>
+
+<file path=customXml/item4.xml><?xml version="1.0" encoding="utf-8"?>
 <ct:contentTypeSchema xmlns:ct="http://schemas.microsoft.com/office/2006/metadata/contentType" xmlns:ma="http://schemas.microsoft.com/office/2006/metadata/properties/metaAttributes" ct:_="" ma:_="" ma:contentTypeName="Document" ma:contentTypeID="0x010100BFE23AECFE52364A8A98EA25BDA3683F" ma:contentTypeVersion="4" ma:contentTypeDescription="Create a new document." ma:contentTypeScope="" ma:versionID="1eca33916b708c21ddc29dd7788dcbcd">
   <xsd:schema xmlns:xsd="http://www.w3.org/2001/XMLSchema" xmlns:xs="http://www.w3.org/2001/XMLSchema" xmlns:p="http://schemas.microsoft.com/office/2006/metadata/properties" xmlns:ns2="fba194e7-2683-4f97-bdd1-724a90e6bf16" targetNamespace="http://schemas.microsoft.com/office/2006/metadata/properties" ma:root="true" ma:fieldsID="1371edab1fd990fcfe90527ebd9c2baf" ns2:_="">
     <xsd:import namespace="fba194e7-2683-4f97-bdd1-724a90e6bf16"/>
@@ -19499,26 +18184,32 @@
 </ct:contentTypeSchema>
 </file>
 
-<file path=customXml/item2.xml><?xml version="1.0" encoding="utf-8"?>
-<?mso-contentType ?>
-<FormTemplates xmlns="http://schemas.microsoft.com/sharepoint/v3/contenttype/forms">
-  <Display>DocumentLibraryForm</Display>
-  <Edit>DocumentLibraryForm</Edit>
-  <New>DocumentLibraryForm</New>
-</FormTemplates>
+<file path=customXml/itemProps1.xml><?xml version="1.0" encoding="utf-8"?>
+<ds:datastoreItem xmlns:ds="http://schemas.openxmlformats.org/officeDocument/2006/customXml" ds:itemID="{2DE8FB53-EBD3-43C5-81E6-378207BB39E0}">
+  <ds:schemaRefs>
+    <ds:schemaRef ds:uri="http://schemas.microsoft.com/office/2006/metadata/properties"/>
+    <ds:schemaRef ds:uri="http://schemas.microsoft.com/office/infopath/2007/PartnerControls"/>
+  </ds:schemaRefs>
+</ds:datastoreItem>
 </file>
 
-<file path=customXml/item3.xml><?xml version="1.0" encoding="utf-8"?>
-<b:Sources xmlns:b="http://schemas.openxmlformats.org/officeDocument/2006/bibliography" xmlns="http://schemas.openxmlformats.org/officeDocument/2006/bibliography" SelectedStyle="\APA.XSL" StyleName="APA"/>
+<file path=customXml/itemProps2.xml><?xml version="1.0" encoding="utf-8"?>
+<ds:datastoreItem xmlns:ds="http://schemas.openxmlformats.org/officeDocument/2006/customXml" ds:itemID="{E9CC6AA7-D18A-45A5-9DD4-7BB6176A8D22}">
+  <ds:schemaRefs>
+    <ds:schemaRef ds:uri="http://schemas.openxmlformats.org/officeDocument/2006/bibliography"/>
+  </ds:schemaRefs>
+</ds:datastoreItem>
 </file>
 
-<file path=customXml/item4.xml><?xml version="1.0" encoding="utf-8"?>
-<p:properties xmlns:p="http://schemas.microsoft.com/office/2006/metadata/properties" xmlns:xsi="http://www.w3.org/2001/XMLSchema-instance" xmlns:pc="http://schemas.microsoft.com/office/infopath/2007/PartnerControls">
-  <documentManagement/>
-</p:properties>
+<file path=customXml/itemProps3.xml><?xml version="1.0" encoding="utf-8"?>
+<ds:datastoreItem xmlns:ds="http://schemas.openxmlformats.org/officeDocument/2006/customXml" ds:itemID="{D4D1E992-3A58-4D79-89F7-CAFF361F9A56}">
+  <ds:schemaRefs>
+    <ds:schemaRef ds:uri="http://schemas.microsoft.com/sharepoint/v3/contenttype/forms"/>
+  </ds:schemaRefs>
+</ds:datastoreItem>
 </file>
 
-<file path=customXml/itemProps1.xml><?xml version="1.0" encoding="utf-8"?>
+<file path=customXml/itemProps4.xml><?xml version="1.0" encoding="utf-8"?>
 <ds:datastoreItem xmlns:ds="http://schemas.openxmlformats.org/officeDocument/2006/customXml" ds:itemID="{4999A1B4-4D0D-4C8A-AE9C-4CEBDD7DC782}">
   <ds:schemaRefs>
     <ds:schemaRef ds:uri="http://schemas.microsoft.com/office/2006/metadata/contentType"/>
@@ -19534,29 +18225,4 @@
     <ds:schemaRef ds:uri="http://schemas.microsoft.com/internal/obd"/>
   </ds:schemaRefs>
 </ds:datastoreItem>
-</file>
-
-<file path=customXml/itemProps2.xml><?xml version="1.0" encoding="utf-8"?>
-<ds:datastoreItem xmlns:ds="http://schemas.openxmlformats.org/officeDocument/2006/customXml" ds:itemID="{D4D1E992-3A58-4D79-89F7-CAFF361F9A56}">
-  <ds:schemaRefs>
-    <ds:schemaRef ds:uri="http://schemas.microsoft.com/sharepoint/v3/contenttype/forms"/>
-  </ds:schemaRefs>
-</ds:datastoreItem>
-</file>
-
-<file path=customXml/itemProps3.xml><?xml version="1.0" encoding="utf-8"?>
-<ds:datastoreItem xmlns:ds="http://schemas.openxmlformats.org/officeDocument/2006/customXml" ds:itemID="{E9CC6AA7-D18A-45A5-9DD4-7BB6176A8D22}">
-  <ds:schemaRefs>
-    <ds:schemaRef ds:uri="http://schemas.openxmlformats.org/officeDocument/2006/bibliography"/>
-  </ds:schemaRefs>
-</ds:datastoreItem>
-</file>
-
-<file path=customXml/itemProps4.xml><?xml version="1.0" encoding="utf-8"?>
-<ds:datastoreItem xmlns:ds="http://schemas.openxmlformats.org/officeDocument/2006/customXml" ds:itemID="{2DE8FB53-EBD3-43C5-81E6-378207BB39E0}">
-  <ds:schemaRefs>
-    <ds:schemaRef ds:uri="http://schemas.microsoft.com/office/2006/metadata/properties"/>
-    <ds:schemaRef ds:uri="http://schemas.microsoft.com/office/infopath/2007/PartnerControls"/>
-  </ds:schemaRefs>
-</ds:datastoreItem>
 </file>
</xml_diff>